<commit_message>
Conclusão das tarefas da reunião de 06/04/2026
Inclusão do Documento Plano de Testes e Atualização do Dicionário de Dados
</commit_message>
<xml_diff>
--- a/Dicionaŕio de Dados/DDP-ContabilTask-v1.0.docx
+++ b/Dicionaŕio de Dados/DDP-ContabilTask-v1.0.docx
@@ -559,7 +559,7 @@
       </w:tr>
       <w:tr>
         <w:trPr>
-          <w:trHeight w:val="229"/>
+          <w:trHeight w:val="459"/>
         </w:trPr>
         <w:tc>
           <w:tcPr>
@@ -593,6 +593,13 @@
             <w:r>
               <w:rPr>
                 <w:rFonts w:ascii="Times New Roman" w:hAnsi="Times New Roman" w:eastAsia="Times New Roman" w:cs="Times New Roman"/>
+                <w:sz w:val="20"/>
+                <w:szCs w:val="20"/>
+              </w:rPr>
+            </w:r>
+            <w:r>
+              <w:rPr>
+                <w:rFonts w:ascii="Times New Roman" w:hAnsi="Times New Roman" w:cs="Times New Roman"/>
                 <w:sz w:val="20"/>
                 <w:szCs w:val="20"/>
               </w:rPr>
@@ -635,6 +642,13 @@
                 <w:szCs w:val="20"/>
               </w:rPr>
             </w:r>
+            <w:r>
+              <w:rPr>
+                <w:rFonts w:ascii="Times New Roman" w:hAnsi="Times New Roman" w:cs="Times New Roman"/>
+                <w:sz w:val="20"/>
+                <w:szCs w:val="20"/>
+              </w:rPr>
+            </w:r>
           </w:p>
         </w:tc>
         <w:tc>
@@ -673,6 +687,13 @@
                 <w:szCs w:val="20"/>
               </w:rPr>
             </w:r>
+            <w:r>
+              <w:rPr>
+                <w:rFonts w:ascii="Times New Roman" w:hAnsi="Times New Roman" w:cs="Times New Roman"/>
+                <w:sz w:val="20"/>
+                <w:szCs w:val="20"/>
+              </w:rPr>
+            </w:r>
           </w:p>
         </w:tc>
         <w:tc>
@@ -711,6 +732,13 @@
                 <w:szCs w:val="20"/>
               </w:rPr>
             </w:r>
+            <w:r>
+              <w:rPr>
+                <w:rFonts w:ascii="Times New Roman" w:hAnsi="Times New Roman" w:cs="Times New Roman"/>
+                <w:sz w:val="20"/>
+                <w:szCs w:val="20"/>
+              </w:rPr>
+            </w:r>
           </w:p>
         </w:tc>
         <w:tc>
@@ -749,6 +777,231 @@
                 <w:szCs w:val="20"/>
               </w:rPr>
               <w:t xml:space="preserve">ão do Documento de acordo com script</w:t>
+            </w:r>
+            <w:r>
+              <w:rPr>
+                <w:rFonts w:ascii="Times New Roman" w:hAnsi="Times New Roman" w:eastAsia="Times New Roman" w:cs="Times New Roman"/>
+                <w:sz w:val="20"/>
+                <w:szCs w:val="20"/>
+              </w:rPr>
+            </w:r>
+            <w:r>
+              <w:rPr>
+                <w:rFonts w:ascii="Times New Roman" w:hAnsi="Times New Roman" w:cs="Times New Roman"/>
+                <w:sz w:val="20"/>
+                <w:szCs w:val="20"/>
+              </w:rPr>
+            </w:r>
+          </w:p>
+        </w:tc>
+      </w:tr>
+      <w:tr>
+        <w:trPr>
+          <w:trHeight w:val="459"/>
+        </w:trPr>
+        <w:tc>
+          <w:tcPr>
+            <w:tcBorders/>
+            <w:tcW w:w="1700" w:type="dxa"/>
+            <w:vAlign w:val="center"/>
+            <w:vMerge w:val="restart"/>
+            <w:textDirection w:val="lrTb"/>
+            <w:noWrap w:val="false"/>
+          </w:tcPr>
+          <w:p>
+            <w:pPr>
+              <w:pBdr/>
+              <w:spacing/>
+              <w:ind/>
+              <w:jc w:val="center"/>
+              <w:rPr>
+                <w:rFonts w:ascii="Times New Roman" w:hAnsi="Times New Roman" w:eastAsia="Times New Roman" w:cs="Times New Roman"/>
+                <w:sz w:val="20"/>
+                <w:szCs w:val="20"/>
+              </w:rPr>
+            </w:pPr>
+            <w:r>
+              <w:rPr>
+                <w:rFonts w:ascii="Times New Roman" w:hAnsi="Times New Roman" w:eastAsia="Times New Roman" w:cs="Times New Roman"/>
+                <w:sz w:val="20"/>
+                <w:szCs w:val="20"/>
+              </w:rPr>
+              <w:t xml:space="preserve">Gustavo Trausula</w:t>
+            </w:r>
+            <w:r>
+              <w:rPr>
+                <w:rFonts w:ascii="Times New Roman" w:hAnsi="Times New Roman" w:eastAsia="Times New Roman" w:cs="Times New Roman"/>
+                <w:sz w:val="20"/>
+                <w:szCs w:val="20"/>
+              </w:rPr>
+            </w:r>
+          </w:p>
+        </w:tc>
+        <w:tc>
+          <w:tcPr>
+            <w:tcBorders/>
+            <w:tcW w:w="1984" w:type="dxa"/>
+            <w:vAlign w:val="center"/>
+            <w:vMerge w:val="restart"/>
+            <w:textDirection w:val="lrTb"/>
+            <w:noWrap w:val="false"/>
+          </w:tcPr>
+          <w:p>
+            <w:pPr>
+              <w:pBdr/>
+              <w:spacing/>
+              <w:ind/>
+              <w:jc w:val="center"/>
+              <w:rPr>
+                <w:rFonts w:ascii="Times New Roman" w:hAnsi="Times New Roman" w:eastAsia="Times New Roman" w:cs="Times New Roman"/>
+                <w:sz w:val="20"/>
+                <w:szCs w:val="20"/>
+              </w:rPr>
+            </w:pPr>
+            <w:r>
+              <w:rPr>
+                <w:rFonts w:ascii="Times New Roman" w:hAnsi="Times New Roman" w:eastAsia="Times New Roman" w:cs="Times New Roman"/>
+                <w:sz w:val="20"/>
+                <w:szCs w:val="20"/>
+              </w:rPr>
+              <w:t xml:space="preserve">-</w:t>
+            </w:r>
+            <w:r>
+              <w:rPr>
+                <w:rFonts w:ascii="Times New Roman" w:hAnsi="Times New Roman" w:eastAsia="Times New Roman" w:cs="Times New Roman"/>
+                <w:sz w:val="20"/>
+                <w:szCs w:val="20"/>
+              </w:rPr>
+            </w:r>
+          </w:p>
+        </w:tc>
+        <w:tc>
+          <w:tcPr>
+            <w:tcBorders/>
+            <w:tcW w:w="2409" w:type="dxa"/>
+            <w:vAlign w:val="center"/>
+            <w:vMerge w:val="restart"/>
+            <w:textDirection w:val="lrTb"/>
+            <w:noWrap w:val="false"/>
+          </w:tcPr>
+          <w:p>
+            <w:pPr>
+              <w:pBdr/>
+              <w:spacing/>
+              <w:ind/>
+              <w:jc w:val="center"/>
+              <w:rPr>
+                <w:rFonts w:ascii="Times New Roman" w:hAnsi="Times New Roman" w:eastAsia="Times New Roman" w:cs="Times New Roman"/>
+                <w:sz w:val="20"/>
+                <w:szCs w:val="20"/>
+              </w:rPr>
+            </w:pPr>
+            <w:r>
+              <w:rPr>
+                <w:rFonts w:ascii="Times New Roman" w:hAnsi="Times New Roman" w:eastAsia="Times New Roman" w:cs="Times New Roman"/>
+                <w:sz w:val="20"/>
+                <w:szCs w:val="20"/>
+              </w:rPr>
+              <w:t xml:space="preserve">08/04/2026</w:t>
+            </w:r>
+            <w:r>
+              <w:rPr>
+                <w:rFonts w:ascii="Times New Roman" w:hAnsi="Times New Roman" w:eastAsia="Times New Roman" w:cs="Times New Roman"/>
+                <w:sz w:val="20"/>
+                <w:szCs w:val="20"/>
+              </w:rPr>
+            </w:r>
+          </w:p>
+        </w:tc>
+        <w:tc>
+          <w:tcPr>
+            <w:tcBorders/>
+            <w:tcW w:w="992" w:type="dxa"/>
+            <w:vAlign w:val="center"/>
+            <w:vMerge w:val="restart"/>
+            <w:textDirection w:val="lrTb"/>
+            <w:noWrap w:val="false"/>
+          </w:tcPr>
+          <w:p>
+            <w:pPr>
+              <w:pBdr/>
+              <w:spacing/>
+              <w:ind/>
+              <w:jc w:val="center"/>
+              <w:rPr>
+                <w:rFonts w:ascii="Times New Roman" w:hAnsi="Times New Roman" w:eastAsia="Times New Roman" w:cs="Times New Roman"/>
+                <w:sz w:val="20"/>
+                <w:szCs w:val="20"/>
+              </w:rPr>
+            </w:pPr>
+            <w:r>
+              <w:rPr>
+                <w:rFonts w:ascii="Times New Roman" w:hAnsi="Times New Roman" w:eastAsia="Times New Roman" w:cs="Times New Roman"/>
+                <w:sz w:val="20"/>
+                <w:szCs w:val="20"/>
+              </w:rPr>
+              <w:t xml:space="preserve">2.1</w:t>
+            </w:r>
+            <w:r>
+              <w:rPr>
+                <w:rFonts w:ascii="Times New Roman" w:hAnsi="Times New Roman" w:eastAsia="Times New Roman" w:cs="Times New Roman"/>
+                <w:sz w:val="20"/>
+                <w:szCs w:val="20"/>
+              </w:rPr>
+            </w:r>
+          </w:p>
+        </w:tc>
+        <w:tc>
+          <w:tcPr>
+            <w:tcBorders/>
+            <w:tcW w:w="3544" w:type="dxa"/>
+            <w:vAlign w:val="center"/>
+            <w:vMerge w:val="restart"/>
+            <w:textDirection w:val="lrTb"/>
+            <w:noWrap w:val="false"/>
+          </w:tcPr>
+          <w:p>
+            <w:pPr>
+              <w:pBdr/>
+              <w:spacing/>
+              <w:ind/>
+              <w:jc w:val="left"/>
+              <w:rPr>
+                <w:rFonts w:ascii="Times New Roman" w:hAnsi="Times New Roman" w:eastAsia="Times New Roman" w:cs="Times New Roman"/>
+                <w:sz w:val="20"/>
+                <w:szCs w:val="20"/>
+              </w:rPr>
+            </w:pPr>
+            <w:r>
+              <w:rPr>
+                <w:rFonts w:ascii="Times New Roman" w:hAnsi="Times New Roman" w:eastAsia="Times New Roman" w:cs="Times New Roman"/>
+                <w:sz w:val="20"/>
+                <w:szCs w:val="20"/>
+              </w:rPr>
+              <w:t xml:space="preserve">Inclus</w:t>
+            </w:r>
+            <w:r>
+              <w:rPr>
+                <w:rFonts w:ascii="Times New Roman" w:hAnsi="Times New Roman" w:eastAsia="Times New Roman" w:cs="Times New Roman"/>
+                <w:sz w:val="20"/>
+                <w:szCs w:val="20"/>
+              </w:rPr>
+              <w:t xml:space="preserve">ão dos campos de token e data de validade do token nas tabelas de usu</w:t>
+            </w:r>
+            <w:r>
+              <w:rPr>
+                <w:rFonts w:ascii="Times New Roman" w:hAnsi="Times New Roman" w:eastAsia="Times New Roman" w:cs="Times New Roman"/>
+                <w:sz w:val="20"/>
+                <w:szCs w:val="20"/>
+              </w:rPr>
+              <w:t xml:space="preserve">ários</w:t>
+            </w:r>
+            <w:r>
+              <w:rPr>
+                <w:rFonts w:ascii="Times New Roman" w:hAnsi="Times New Roman" w:eastAsia="Times New Roman" w:cs="Times New Roman"/>
+                <w:sz w:val="20"/>
+                <w:szCs w:val="20"/>
+              </w:rPr>
             </w:r>
             <w:r>
               <w:rPr>
@@ -1196,7 +1449,7 @@
             </w:r>
             <w:r>
               <w:rPr>
-                <w:rFonts w:ascii="Times New Roman" w:hAnsi="Times New Roman" w:eastAsia="Times New Roman" w:cs="Times New Roman"/>
+                <w:rFonts w:ascii="Times New Roman" w:hAnsi="Times New Roman" w:cs="Times New Roman"/>
                 <w:sz w:val="20"/>
                 <w:szCs w:val="20"/>
               </w:rPr>
@@ -1239,7 +1492,7 @@
             </w:r>
             <w:r>
               <w:rPr>
-                <w:rFonts w:ascii="Times New Roman" w:hAnsi="Times New Roman" w:eastAsia="Times New Roman" w:cs="Times New Roman"/>
+                <w:rFonts w:ascii="Times New Roman" w:hAnsi="Times New Roman" w:cs="Times New Roman"/>
                 <w:sz w:val="20"/>
                 <w:szCs w:val="20"/>
               </w:rPr>
@@ -1282,7 +1535,7 @@
             </w:r>
             <w:r>
               <w:rPr>
-                <w:rFonts w:ascii="Times New Roman" w:hAnsi="Times New Roman" w:eastAsia="Times New Roman" w:cs="Times New Roman"/>
+                <w:rFonts w:ascii="Times New Roman" w:hAnsi="Times New Roman" w:cs="Times New Roman"/>
                 <w:sz w:val="20"/>
                 <w:szCs w:val="20"/>
               </w:rPr>
@@ -1325,7 +1578,7 @@
             </w:r>
             <w:r>
               <w:rPr>
-                <w:rFonts w:ascii="Times New Roman" w:hAnsi="Times New Roman" w:eastAsia="Times New Roman" w:cs="Times New Roman"/>
+                <w:rFonts w:ascii="Times New Roman" w:hAnsi="Times New Roman" w:cs="Times New Roman"/>
                 <w:sz w:val="20"/>
                 <w:szCs w:val="20"/>
               </w:rPr>
@@ -1368,7 +1621,7 @@
             </w:r>
             <w:r>
               <w:rPr>
-                <w:rFonts w:ascii="Times New Roman" w:hAnsi="Times New Roman" w:eastAsia="Times New Roman" w:cs="Times New Roman"/>
+                <w:rFonts w:ascii="Times New Roman" w:hAnsi="Times New Roman" w:cs="Times New Roman"/>
                 <w:sz w:val="20"/>
                 <w:szCs w:val="20"/>
               </w:rPr>
@@ -1411,7 +1664,7 @@
             </w:r>
             <w:r>
               <w:rPr>
-                <w:rFonts w:ascii="Times New Roman" w:hAnsi="Times New Roman" w:eastAsia="Times New Roman" w:cs="Times New Roman"/>
+                <w:rFonts w:ascii="Times New Roman" w:hAnsi="Times New Roman" w:cs="Times New Roman"/>
                 <w:sz w:val="20"/>
                 <w:szCs w:val="20"/>
               </w:rPr>
@@ -1457,7 +1710,7 @@
             </w:r>
             <w:r>
               <w:rPr>
-                <w:rFonts w:ascii="Times New Roman" w:hAnsi="Times New Roman" w:eastAsia="Times New Roman" w:cs="Times New Roman"/>
+                <w:rFonts w:ascii="Times New Roman" w:hAnsi="Times New Roman" w:cs="Times New Roman"/>
                 <w:sz w:val="20"/>
                 <w:szCs w:val="20"/>
               </w:rPr>
@@ -1500,7 +1753,7 @@
             </w:r>
             <w:r>
               <w:rPr>
-                <w:rFonts w:ascii="Times New Roman" w:hAnsi="Times New Roman" w:eastAsia="Times New Roman" w:cs="Times New Roman"/>
+                <w:rFonts w:ascii="Times New Roman" w:hAnsi="Times New Roman" w:cs="Times New Roman"/>
                 <w:sz w:val="20"/>
                 <w:szCs w:val="20"/>
               </w:rPr>
@@ -1543,7 +1796,7 @@
             </w:r>
             <w:r>
               <w:rPr>
-                <w:rFonts w:ascii="Times New Roman" w:hAnsi="Times New Roman" w:eastAsia="Times New Roman" w:cs="Times New Roman"/>
+                <w:rFonts w:ascii="Times New Roman" w:hAnsi="Times New Roman" w:cs="Times New Roman"/>
                 <w:sz w:val="20"/>
                 <w:szCs w:val="20"/>
               </w:rPr>
@@ -1586,7 +1839,7 @@
             </w:r>
             <w:r>
               <w:rPr>
-                <w:rFonts w:ascii="Times New Roman" w:hAnsi="Times New Roman" w:eastAsia="Times New Roman" w:cs="Times New Roman"/>
+                <w:rFonts w:ascii="Times New Roman" w:hAnsi="Times New Roman" w:cs="Times New Roman"/>
                 <w:sz w:val="20"/>
                 <w:szCs w:val="20"/>
               </w:rPr>
@@ -1629,7 +1882,7 @@
             </w:r>
             <w:r>
               <w:rPr>
-                <w:rFonts w:ascii="Times New Roman" w:hAnsi="Times New Roman" w:eastAsia="Times New Roman" w:cs="Times New Roman"/>
+                <w:rFonts w:ascii="Times New Roman" w:hAnsi="Times New Roman" w:cs="Times New Roman"/>
                 <w:sz w:val="20"/>
                 <w:szCs w:val="20"/>
               </w:rPr>
@@ -1672,7 +1925,7 @@
             </w:r>
             <w:r>
               <w:rPr>
-                <w:rFonts w:ascii="Times New Roman" w:hAnsi="Times New Roman" w:eastAsia="Times New Roman" w:cs="Times New Roman"/>
+                <w:rFonts w:ascii="Times New Roman" w:hAnsi="Times New Roman" w:cs="Times New Roman"/>
                 <w:sz w:val="20"/>
                 <w:szCs w:val="20"/>
               </w:rPr>
@@ -1718,7 +1971,7 @@
             </w:r>
             <w:r>
               <w:rPr>
-                <w:rFonts w:ascii="Times New Roman" w:hAnsi="Times New Roman" w:eastAsia="Times New Roman" w:cs="Times New Roman"/>
+                <w:rFonts w:ascii="Times New Roman" w:hAnsi="Times New Roman" w:cs="Times New Roman"/>
                 <w:sz w:val="20"/>
                 <w:szCs w:val="20"/>
               </w:rPr>
@@ -1761,7 +2014,7 @@
             </w:r>
             <w:r>
               <w:rPr>
-                <w:rFonts w:ascii="Times New Roman" w:hAnsi="Times New Roman" w:eastAsia="Times New Roman" w:cs="Times New Roman"/>
+                <w:rFonts w:ascii="Times New Roman" w:hAnsi="Times New Roman" w:cs="Times New Roman"/>
                 <w:sz w:val="20"/>
                 <w:szCs w:val="20"/>
               </w:rPr>
@@ -1804,7 +2057,7 @@
             </w:r>
             <w:r>
               <w:rPr>
-                <w:rFonts w:ascii="Times New Roman" w:hAnsi="Times New Roman" w:eastAsia="Times New Roman" w:cs="Times New Roman"/>
+                <w:rFonts w:ascii="Times New Roman" w:hAnsi="Times New Roman" w:cs="Times New Roman"/>
                 <w:sz w:val="20"/>
                 <w:szCs w:val="20"/>
               </w:rPr>
@@ -1847,7 +2100,7 @@
             </w:r>
             <w:r>
               <w:rPr>
-                <w:rFonts w:ascii="Times New Roman" w:hAnsi="Times New Roman" w:eastAsia="Times New Roman" w:cs="Times New Roman"/>
+                <w:rFonts w:ascii="Times New Roman" w:hAnsi="Times New Roman" w:cs="Times New Roman"/>
                 <w:sz w:val="20"/>
                 <w:szCs w:val="20"/>
               </w:rPr>
@@ -1890,7 +2143,7 @@
             </w:r>
             <w:r>
               <w:rPr>
-                <w:rFonts w:ascii="Times New Roman" w:hAnsi="Times New Roman" w:eastAsia="Times New Roman" w:cs="Times New Roman"/>
+                <w:rFonts w:ascii="Times New Roman" w:hAnsi="Times New Roman" w:cs="Times New Roman"/>
                 <w:sz w:val="20"/>
                 <w:szCs w:val="20"/>
               </w:rPr>
@@ -1933,7 +2186,7 @@
             </w:r>
             <w:r>
               <w:rPr>
-                <w:rFonts w:ascii="Times New Roman" w:hAnsi="Times New Roman" w:eastAsia="Times New Roman" w:cs="Times New Roman"/>
+                <w:rFonts w:ascii="Times New Roman" w:hAnsi="Times New Roman" w:cs="Times New Roman"/>
                 <w:sz w:val="20"/>
                 <w:szCs w:val="20"/>
               </w:rPr>
@@ -2407,15 +2660,6 @@
               </w:rPr>
               <w:t xml:space="preserve"> Contabilidade</w:t>
             </w:r>
-            <w:r/>
-            <w:r>
-              <w:rPr>
-                <w:rFonts w:ascii="Times New Roman" w:hAnsi="Times New Roman" w:eastAsia="Times New Roman" w:cs="Times New Roman"/>
-                <w:color w:val="000000"/>
-                <w:sz w:val="20"/>
-                <w:szCs w:val="20"/>
-              </w:rPr>
-            </w:r>
             <w:r>
               <w:rPr>
                 <w:rFonts w:ascii="Times New Roman" w:hAnsi="Times New Roman" w:cs="Times New Roman"/>
@@ -2686,25 +2930,16 @@
               </w:rPr>
               <w:t xml:space="preserve">Contabilidade</w:t>
             </w:r>
-            <w:r/>
-            <w:r>
-              <w:rPr>
-                <w:rFonts w:ascii="Times New Roman" w:hAnsi="Times New Roman" w:eastAsia="Times New Roman" w:cs="Times New Roman"/>
-                <w:color w:val="000000"/>
-                <w:sz w:val="20"/>
-                <w:szCs w:val="20"/>
-              </w:rPr>
-            </w:r>
-            <w:r>
-              <w:rPr>
-                <w:rFonts w:ascii="Times New Roman" w:hAnsi="Times New Roman" w:eastAsia="Times New Roman" w:cs="Times New Roman"/>
-                <w:sz w:val="20"/>
-                <w:szCs w:val="20"/>
-              </w:rPr>
-            </w:r>
-            <w:r>
-              <w:rPr>
-                <w:rFonts w:ascii="Times New Roman" w:hAnsi="Times New Roman" w:eastAsia="Times New Roman" w:cs="Times New Roman"/>
+            <w:r>
+              <w:rPr>
+                <w:rFonts w:ascii="Times New Roman" w:hAnsi="Times New Roman" w:eastAsia="Times New Roman" w:cs="Times New Roman"/>
+                <w:sz w:val="20"/>
+                <w:szCs w:val="20"/>
+              </w:rPr>
+            </w:r>
+            <w:r>
+              <w:rPr>
+                <w:rFonts w:ascii="Times New Roman" w:hAnsi="Times New Roman" w:cs="Times New Roman"/>
                 <w:sz w:val="20"/>
                 <w:szCs w:val="20"/>
               </w:rPr>
@@ -2747,7 +2982,7 @@
             </w:r>
             <w:r>
               <w:rPr>
-                <w:rFonts w:ascii="Times New Roman" w:hAnsi="Times New Roman" w:eastAsia="Times New Roman" w:cs="Times New Roman"/>
+                <w:rFonts w:ascii="Times New Roman" w:hAnsi="Times New Roman" w:cs="Times New Roman"/>
                 <w:sz w:val="20"/>
                 <w:szCs w:val="20"/>
               </w:rPr>
@@ -2790,7 +3025,7 @@
             </w:r>
             <w:r>
               <w:rPr>
-                <w:rFonts w:ascii="Times New Roman" w:hAnsi="Times New Roman" w:eastAsia="Times New Roman" w:cs="Times New Roman"/>
+                <w:rFonts w:ascii="Times New Roman" w:hAnsi="Times New Roman" w:cs="Times New Roman"/>
                 <w:sz w:val="20"/>
                 <w:szCs w:val="20"/>
               </w:rPr>
@@ -2833,7 +3068,7 @@
             </w:r>
             <w:r>
               <w:rPr>
-                <w:rFonts w:ascii="Times New Roman" w:hAnsi="Times New Roman" w:eastAsia="Times New Roman" w:cs="Times New Roman"/>
+                <w:rFonts w:ascii="Times New Roman" w:hAnsi="Times New Roman" w:cs="Times New Roman"/>
                 <w:sz w:val="20"/>
                 <w:szCs w:val="20"/>
               </w:rPr>
@@ -2876,7 +3111,7 @@
             </w:r>
             <w:r>
               <w:rPr>
-                <w:rFonts w:ascii="Times New Roman" w:hAnsi="Times New Roman" w:eastAsia="Times New Roman" w:cs="Times New Roman"/>
+                <w:rFonts w:ascii="Times New Roman" w:hAnsi="Times New Roman" w:cs="Times New Roman"/>
                 <w:sz w:val="20"/>
                 <w:szCs w:val="20"/>
               </w:rPr>
@@ -2919,7 +3154,7 @@
             </w:r>
             <w:r>
               <w:rPr>
-                <w:rFonts w:ascii="Times New Roman" w:hAnsi="Times New Roman" w:eastAsia="Times New Roman" w:cs="Times New Roman"/>
+                <w:rFonts w:ascii="Times New Roman" w:hAnsi="Times New Roman" w:cs="Times New Roman"/>
                 <w:sz w:val="20"/>
                 <w:szCs w:val="20"/>
               </w:rPr>
@@ -2965,25 +3200,16 @@
               </w:rPr>
               <w:t xml:space="preserve">Contabilidade</w:t>
             </w:r>
-            <w:r/>
-            <w:r>
-              <w:rPr>
-                <w:rFonts w:ascii="Times New Roman" w:hAnsi="Times New Roman" w:eastAsia="Times New Roman" w:cs="Times New Roman"/>
-                <w:color w:val="000000"/>
-                <w:sz w:val="20"/>
-                <w:szCs w:val="20"/>
-              </w:rPr>
-            </w:r>
-            <w:r>
-              <w:rPr>
-                <w:rFonts w:ascii="Times New Roman" w:hAnsi="Times New Roman" w:eastAsia="Times New Roman" w:cs="Times New Roman"/>
-                <w:sz w:val="20"/>
-                <w:szCs w:val="20"/>
-              </w:rPr>
-            </w:r>
-            <w:r>
-              <w:rPr>
-                <w:rFonts w:ascii="Times New Roman" w:hAnsi="Times New Roman" w:eastAsia="Times New Roman" w:cs="Times New Roman"/>
+            <w:r>
+              <w:rPr>
+                <w:rFonts w:ascii="Times New Roman" w:hAnsi="Times New Roman" w:eastAsia="Times New Roman" w:cs="Times New Roman"/>
+                <w:sz w:val="20"/>
+                <w:szCs w:val="20"/>
+              </w:rPr>
+            </w:r>
+            <w:r>
+              <w:rPr>
+                <w:rFonts w:ascii="Times New Roman" w:hAnsi="Times New Roman" w:cs="Times New Roman"/>
                 <w:sz w:val="20"/>
                 <w:szCs w:val="20"/>
               </w:rPr>
@@ -3026,7 +3252,7 @@
             </w:r>
             <w:r>
               <w:rPr>
-                <w:rFonts w:ascii="Times New Roman" w:hAnsi="Times New Roman" w:eastAsia="Times New Roman" w:cs="Times New Roman"/>
+                <w:rFonts w:ascii="Times New Roman" w:hAnsi="Times New Roman" w:cs="Times New Roman"/>
                 <w:sz w:val="20"/>
                 <w:szCs w:val="20"/>
               </w:rPr>
@@ -3069,7 +3295,7 @@
             </w:r>
             <w:r>
               <w:rPr>
-                <w:rFonts w:ascii="Times New Roman" w:hAnsi="Times New Roman" w:eastAsia="Times New Roman" w:cs="Times New Roman"/>
+                <w:rFonts w:ascii="Times New Roman" w:hAnsi="Times New Roman" w:cs="Times New Roman"/>
                 <w:sz w:val="20"/>
                 <w:szCs w:val="20"/>
               </w:rPr>
@@ -3112,7 +3338,7 @@
             </w:r>
             <w:r>
               <w:rPr>
-                <w:rFonts w:ascii="Times New Roman" w:hAnsi="Times New Roman" w:eastAsia="Times New Roman" w:cs="Times New Roman"/>
+                <w:rFonts w:ascii="Times New Roman" w:hAnsi="Times New Roman" w:cs="Times New Roman"/>
                 <w:sz w:val="20"/>
                 <w:szCs w:val="20"/>
               </w:rPr>
@@ -3155,7 +3381,7 @@
             </w:r>
             <w:r>
               <w:rPr>
-                <w:rFonts w:ascii="Times New Roman" w:hAnsi="Times New Roman" w:eastAsia="Times New Roman" w:cs="Times New Roman"/>
+                <w:rFonts w:ascii="Times New Roman" w:hAnsi="Times New Roman" w:cs="Times New Roman"/>
                 <w:sz w:val="20"/>
                 <w:szCs w:val="20"/>
               </w:rPr>
@@ -3198,7 +3424,7 @@
             </w:r>
             <w:r>
               <w:rPr>
-                <w:rFonts w:ascii="Times New Roman" w:hAnsi="Times New Roman" w:eastAsia="Times New Roman" w:cs="Times New Roman"/>
+                <w:rFonts w:ascii="Times New Roman" w:hAnsi="Times New Roman" w:cs="Times New Roman"/>
                 <w:sz w:val="20"/>
                 <w:szCs w:val="20"/>
               </w:rPr>
@@ -3244,25 +3470,16 @@
               </w:rPr>
               <w:t xml:space="preserve">Contabilidade</w:t>
             </w:r>
-            <w:r/>
-            <w:r>
-              <w:rPr>
-                <w:rFonts w:ascii="Times New Roman" w:hAnsi="Times New Roman" w:eastAsia="Times New Roman" w:cs="Times New Roman"/>
-                <w:color w:val="000000"/>
-                <w:sz w:val="20"/>
-                <w:szCs w:val="20"/>
-              </w:rPr>
-            </w:r>
-            <w:r>
-              <w:rPr>
-                <w:rFonts w:ascii="Times New Roman" w:hAnsi="Times New Roman" w:eastAsia="Times New Roman" w:cs="Times New Roman"/>
-                <w:sz w:val="20"/>
-                <w:szCs w:val="20"/>
-              </w:rPr>
-            </w:r>
-            <w:r>
-              <w:rPr>
-                <w:rFonts w:ascii="Times New Roman" w:hAnsi="Times New Roman" w:eastAsia="Times New Roman" w:cs="Times New Roman"/>
+            <w:r>
+              <w:rPr>
+                <w:rFonts w:ascii="Times New Roman" w:hAnsi="Times New Roman" w:eastAsia="Times New Roman" w:cs="Times New Roman"/>
+                <w:sz w:val="20"/>
+                <w:szCs w:val="20"/>
+              </w:rPr>
+            </w:r>
+            <w:r>
+              <w:rPr>
+                <w:rFonts w:ascii="Times New Roman" w:hAnsi="Times New Roman" w:cs="Times New Roman"/>
                 <w:sz w:val="20"/>
                 <w:szCs w:val="20"/>
               </w:rPr>
@@ -3305,7 +3522,7 @@
             </w:r>
             <w:r>
               <w:rPr>
-                <w:rFonts w:ascii="Times New Roman" w:hAnsi="Times New Roman" w:eastAsia="Times New Roman" w:cs="Times New Roman"/>
+                <w:rFonts w:ascii="Times New Roman" w:hAnsi="Times New Roman" w:cs="Times New Roman"/>
                 <w:sz w:val="20"/>
                 <w:szCs w:val="20"/>
               </w:rPr>
@@ -3348,7 +3565,7 @@
             </w:r>
             <w:r>
               <w:rPr>
-                <w:rFonts w:ascii="Times New Roman" w:hAnsi="Times New Roman" w:eastAsia="Times New Roman" w:cs="Times New Roman"/>
+                <w:rFonts w:ascii="Times New Roman" w:hAnsi="Times New Roman" w:cs="Times New Roman"/>
                 <w:sz w:val="20"/>
                 <w:szCs w:val="20"/>
               </w:rPr>
@@ -3391,7 +3608,7 @@
             </w:r>
             <w:r>
               <w:rPr>
-                <w:rFonts w:ascii="Times New Roman" w:hAnsi="Times New Roman" w:eastAsia="Times New Roman" w:cs="Times New Roman"/>
+                <w:rFonts w:ascii="Times New Roman" w:hAnsi="Times New Roman" w:cs="Times New Roman"/>
                 <w:sz w:val="20"/>
                 <w:szCs w:val="20"/>
               </w:rPr>
@@ -3434,7 +3651,7 @@
             </w:r>
             <w:r>
               <w:rPr>
-                <w:rFonts w:ascii="Times New Roman" w:hAnsi="Times New Roman" w:eastAsia="Times New Roman" w:cs="Times New Roman"/>
+                <w:rFonts w:ascii="Times New Roman" w:hAnsi="Times New Roman" w:cs="Times New Roman"/>
                 <w:sz w:val="20"/>
                 <w:szCs w:val="20"/>
               </w:rPr>
@@ -3477,7 +3694,7 @@
             </w:r>
             <w:r>
               <w:rPr>
-                <w:rFonts w:ascii="Times New Roman" w:hAnsi="Times New Roman" w:eastAsia="Times New Roman" w:cs="Times New Roman"/>
+                <w:rFonts w:ascii="Times New Roman" w:hAnsi="Times New Roman" w:cs="Times New Roman"/>
                 <w:sz w:val="20"/>
                 <w:szCs w:val="20"/>
               </w:rPr>
@@ -3523,25 +3740,16 @@
               </w:rPr>
               <w:t xml:space="preserve">Contabilidade</w:t>
             </w:r>
-            <w:r/>
-            <w:r>
-              <w:rPr>
-                <w:rFonts w:ascii="Times New Roman" w:hAnsi="Times New Roman" w:eastAsia="Times New Roman" w:cs="Times New Roman"/>
-                <w:color w:val="000000"/>
-                <w:sz w:val="20"/>
-                <w:szCs w:val="20"/>
-              </w:rPr>
-            </w:r>
-            <w:r>
-              <w:rPr>
-                <w:rFonts w:ascii="Times New Roman" w:hAnsi="Times New Roman" w:eastAsia="Times New Roman" w:cs="Times New Roman"/>
-                <w:sz w:val="20"/>
-                <w:szCs w:val="20"/>
-              </w:rPr>
-            </w:r>
-            <w:r>
-              <w:rPr>
-                <w:rFonts w:ascii="Times New Roman" w:hAnsi="Times New Roman" w:eastAsia="Times New Roman" w:cs="Times New Roman"/>
+            <w:r>
+              <w:rPr>
+                <w:rFonts w:ascii="Times New Roman" w:hAnsi="Times New Roman" w:eastAsia="Times New Roman" w:cs="Times New Roman"/>
+                <w:sz w:val="20"/>
+                <w:szCs w:val="20"/>
+              </w:rPr>
+            </w:r>
+            <w:r>
+              <w:rPr>
+                <w:rFonts w:ascii="Times New Roman" w:hAnsi="Times New Roman" w:cs="Times New Roman"/>
                 <w:sz w:val="20"/>
                 <w:szCs w:val="20"/>
               </w:rPr>
@@ -3584,7 +3792,7 @@
             </w:r>
             <w:r>
               <w:rPr>
-                <w:rFonts w:ascii="Times New Roman" w:hAnsi="Times New Roman" w:eastAsia="Times New Roman" w:cs="Times New Roman"/>
+                <w:rFonts w:ascii="Times New Roman" w:hAnsi="Times New Roman" w:cs="Times New Roman"/>
                 <w:sz w:val="20"/>
                 <w:szCs w:val="20"/>
               </w:rPr>
@@ -3627,7 +3835,7 @@
             </w:r>
             <w:r>
               <w:rPr>
-                <w:rFonts w:ascii="Times New Roman" w:hAnsi="Times New Roman" w:eastAsia="Times New Roman" w:cs="Times New Roman"/>
+                <w:rFonts w:ascii="Times New Roman" w:hAnsi="Times New Roman" w:cs="Times New Roman"/>
                 <w:sz w:val="20"/>
                 <w:szCs w:val="20"/>
               </w:rPr>
@@ -3667,6 +3875,13 @@
                 <w:szCs w:val="20"/>
               </w:rPr>
             </w:r>
+            <w:r>
+              <w:rPr>
+                <w:rFonts w:ascii="Times New Roman" w:hAnsi="Times New Roman" w:cs="Times New Roman"/>
+                <w:sz w:val="20"/>
+                <w:szCs w:val="20"/>
+              </w:rPr>
+            </w:r>
           </w:p>
         </w:tc>
         <w:tc>
@@ -3705,7 +3920,7 @@
             </w:r>
             <w:r>
               <w:rPr>
-                <w:rFonts w:ascii="Times New Roman" w:hAnsi="Times New Roman" w:eastAsia="Times New Roman" w:cs="Times New Roman"/>
+                <w:rFonts w:ascii="Times New Roman" w:hAnsi="Times New Roman" w:cs="Times New Roman"/>
                 <w:sz w:val="20"/>
                 <w:szCs w:val="20"/>
               </w:rPr>
@@ -3748,7 +3963,636 @@
             </w:r>
             <w:r>
               <w:rPr>
-                <w:rFonts w:ascii="Times New Roman" w:hAnsi="Times New Roman" w:eastAsia="Times New Roman" w:cs="Times New Roman"/>
+                <w:rFonts w:ascii="Times New Roman" w:hAnsi="Times New Roman" w:cs="Times New Roman"/>
+                <w:sz w:val="20"/>
+                <w:szCs w:val="20"/>
+              </w:rPr>
+            </w:r>
+          </w:p>
+        </w:tc>
+      </w:tr>
+      <w:tr>
+        <w:trPr/>
+        <w:tc>
+          <w:tcPr>
+            <w:tcBorders/>
+            <w:tcW w:w="3401" w:type="dxa"/>
+            <w:vAlign w:val="center"/>
+            <w:vMerge w:val="restart"/>
+          </w:tcPr>
+          <w:p>
+            <w:pPr>
+              <w:pBdr/>
+              <w:spacing w:after="0" w:before="0" w:line="240" w:lineRule="auto"/>
+              <w:ind/>
+              <w:rPr>
+                <w:rFonts w:ascii="Times New Roman" w:hAnsi="Times New Roman" w:eastAsia="Times New Roman" w:cs="Times New Roman"/>
+                <w:color w:val="000000"/>
+                <w:sz w:val="20"/>
+                <w:szCs w:val="20"/>
+              </w:rPr>
+            </w:pPr>
+            <w:r>
+              <w:rPr>
+                <w:rFonts w:ascii="Times New Roman" w:hAnsi="Times New Roman" w:eastAsia="Times New Roman" w:cs="Times New Roman"/>
+                <w:color w:val="000000"/>
+                <w:sz w:val="20"/>
+                <w:szCs w:val="20"/>
+              </w:rPr>
+              <w:t xml:space="preserve">Token de Acesso do Usu</w:t>
+            </w:r>
+            <w:r>
+              <w:rPr>
+                <w:rFonts w:ascii="Times New Roman" w:hAnsi="Times New Roman" w:eastAsia="Times New Roman" w:cs="Times New Roman"/>
+                <w:color w:val="000000"/>
+                <w:sz w:val="20"/>
+                <w:szCs w:val="20"/>
+              </w:rPr>
+              <w:t xml:space="preserve">ário Contabilidade</w:t>
+            </w:r>
+            <w:r>
+              <w:rPr>
+                <w:rFonts w:ascii="Times New Roman" w:hAnsi="Times New Roman" w:eastAsia="Times New Roman" w:cs="Times New Roman"/>
+                <w:color w:val="000000"/>
+                <w:sz w:val="20"/>
+                <w:szCs w:val="20"/>
+              </w:rPr>
+            </w:r>
+          </w:p>
+        </w:tc>
+        <w:tc>
+          <w:tcPr>
+            <w:tcBorders/>
+            <w:tcW w:w="2126" w:type="dxa"/>
+            <w:vAlign w:val="center"/>
+            <w:vMerge w:val="restart"/>
+          </w:tcPr>
+          <w:p>
+            <w:pPr>
+              <w:pBdr/>
+              <w:spacing w:after="0" w:before="0" w:line="240" w:lineRule="auto"/>
+              <w:ind/>
+              <w:rPr>
+                <w:rFonts w:ascii="Times New Roman" w:hAnsi="Times New Roman" w:eastAsia="Times New Roman" w:cs="Times New Roman"/>
+                <w:color w:val="000000"/>
+                <w:sz w:val="20"/>
+                <w:szCs w:val="20"/>
+              </w:rPr>
+            </w:pPr>
+            <w:r>
+              <w:rPr>
+                <w:rFonts w:ascii="Times New Roman" w:hAnsi="Times New Roman" w:eastAsia="Times New Roman" w:cs="Times New Roman"/>
+                <w:color w:val="000000"/>
+                <w:sz w:val="20"/>
+                <w:szCs w:val="20"/>
+              </w:rPr>
+            </w:r>
+            <w:r>
+              <w:rPr>
+                <w:rFonts w:ascii="Times New Roman" w:hAnsi="Times New Roman" w:eastAsia="Times New Roman" w:cs="Times New Roman"/>
+                <w:color w:val="000000"/>
+                <w:sz w:val="20"/>
+                <w:szCs w:val="20"/>
+              </w:rPr>
+              <w:t xml:space="preserve">accountingusertoken</w:t>
+            </w:r>
+            <w:r>
+              <w:rPr>
+                <w:rFonts w:ascii="Times New Roman" w:hAnsi="Times New Roman" w:eastAsia="Times New Roman" w:cs="Times New Roman"/>
+                <w:color w:val="000000"/>
+                <w:sz w:val="20"/>
+                <w:szCs w:val="20"/>
+              </w:rPr>
+            </w:r>
+            <w:r>
+              <w:rPr>
+                <w:rFonts w:ascii="Times New Roman" w:hAnsi="Times New Roman" w:eastAsia="Times New Roman" w:cs="Times New Roman"/>
+                <w:color w:val="000000"/>
+                <w:sz w:val="20"/>
+                <w:szCs w:val="20"/>
+              </w:rPr>
+            </w:r>
+          </w:p>
+        </w:tc>
+        <w:tc>
+          <w:tcPr>
+            <w:tcBorders/>
+            <w:tcW w:w="992" w:type="dxa"/>
+            <w:vAlign w:val="center"/>
+            <w:vMerge w:val="restart"/>
+          </w:tcPr>
+          <w:p>
+            <w:pPr>
+              <w:pBdr/>
+              <w:spacing w:after="0" w:before="0" w:line="240" w:lineRule="auto"/>
+              <w:ind/>
+              <w:rPr>
+                <w:rFonts w:ascii="Times New Roman" w:hAnsi="Times New Roman" w:cs="Times New Roman"/>
+                <w:sz w:val="20"/>
+                <w:szCs w:val="20"/>
+              </w:rPr>
+            </w:pPr>
+            <w:r>
+              <w:rPr>
+                <w:rFonts w:ascii="Times New Roman" w:hAnsi="Times New Roman" w:eastAsia="Times New Roman" w:cs="Times New Roman"/>
+                <w:color w:val="000000"/>
+                <w:sz w:val="20"/>
+                <w:szCs w:val="20"/>
+              </w:rPr>
+              <w:t xml:space="preserve">Varchar</w:t>
+            </w:r>
+            <w:r>
+              <w:rPr>
+                <w:rFonts w:ascii="Times New Roman" w:hAnsi="Times New Roman" w:cs="Times New Roman"/>
+                <w:sz w:val="20"/>
+                <w:szCs w:val="20"/>
+              </w:rPr>
+            </w:r>
+            <w:r>
+              <w:rPr>
+                <w:rFonts w:ascii="Times New Roman" w:hAnsi="Times New Roman" w:cs="Times New Roman"/>
+                <w:sz w:val="20"/>
+                <w:szCs w:val="20"/>
+              </w:rPr>
+            </w:r>
+          </w:p>
+          <w:p>
+            <w:pPr>
+              <w:pBdr/>
+              <w:spacing w:after="0" w:before="0" w:line="240" w:lineRule="auto"/>
+              <w:ind/>
+              <w:rPr>
+                <w:rFonts w:ascii="Times New Roman" w:hAnsi="Times New Roman" w:eastAsia="Times New Roman" w:cs="Times New Roman"/>
+                <w:color w:val="000000"/>
+                <w:sz w:val="20"/>
+                <w:szCs w:val="20"/>
+              </w:rPr>
+            </w:pPr>
+            <w:r>
+              <w:rPr>
+                <w:rFonts w:ascii="Times New Roman" w:hAnsi="Times New Roman" w:eastAsia="Times New Roman" w:cs="Times New Roman"/>
+                <w:color w:val="000000"/>
+                <w:sz w:val="20"/>
+                <w:szCs w:val="20"/>
+              </w:rPr>
+            </w:r>
+            <w:r>
+              <w:rPr>
+                <w:rFonts w:ascii="Times New Roman" w:hAnsi="Times New Roman" w:eastAsia="Times New Roman" w:cs="Times New Roman"/>
+                <w:color w:val="000000"/>
+                <w:sz w:val="20"/>
+                <w:szCs w:val="20"/>
+              </w:rPr>
+            </w:r>
+          </w:p>
+        </w:tc>
+        <w:tc>
+          <w:tcPr>
+            <w:tcBorders/>
+            <w:tcW w:w="1701" w:type="dxa"/>
+            <w:vAlign w:val="center"/>
+            <w:vMerge w:val="restart"/>
+          </w:tcPr>
+          <w:p>
+            <w:pPr>
+              <w:pBdr/>
+              <w:spacing w:after="0" w:before="0" w:line="240" w:lineRule="auto"/>
+              <w:ind/>
+              <w:rPr>
+                <w:rFonts w:ascii="Times New Roman" w:hAnsi="Times New Roman" w:eastAsia="Times New Roman" w:cs="Times New Roman"/>
+                <w:sz w:val="20"/>
+                <w:szCs w:val="20"/>
+              </w:rPr>
+            </w:pPr>
+            <w:r>
+              <w:rPr>
+                <w:rFonts w:ascii="Times New Roman" w:hAnsi="Times New Roman" w:eastAsia="Times New Roman" w:cs="Times New Roman"/>
+                <w:sz w:val="20"/>
+                <w:szCs w:val="20"/>
+              </w:rPr>
+              <w:t xml:space="preserve">Sim</w:t>
+            </w:r>
+            <w:r>
+              <w:rPr>
+                <w:rFonts w:ascii="Times New Roman" w:hAnsi="Times New Roman" w:eastAsia="Times New Roman" w:cs="Times New Roman"/>
+                <w:sz w:val="20"/>
+                <w:szCs w:val="20"/>
+              </w:rPr>
+            </w:r>
+          </w:p>
+        </w:tc>
+        <w:tc>
+          <w:tcPr>
+            <w:tcBorders/>
+            <w:tcW w:w="1134" w:type="dxa"/>
+            <w:vAlign w:val="center"/>
+            <w:vMerge w:val="restart"/>
+          </w:tcPr>
+          <w:p>
+            <w:pPr>
+              <w:pBdr/>
+              <w:spacing w:after="0" w:before="0" w:line="240" w:lineRule="auto"/>
+              <w:ind/>
+              <w:rPr>
+                <w:rFonts w:ascii="Times New Roman" w:hAnsi="Times New Roman" w:eastAsia="Times New Roman" w:cs="Times New Roman"/>
+                <w:color w:val="000000"/>
+                <w:sz w:val="20"/>
+                <w:szCs w:val="20"/>
+                <w:highlight w:val="none"/>
+              </w:rPr>
+            </w:pPr>
+            <w:r>
+              <w:rPr>
+                <w:rFonts w:ascii="Times New Roman" w:hAnsi="Times New Roman" w:eastAsia="Times New Roman" w:cs="Times New Roman"/>
+                <w:color w:val="000000"/>
+                <w:sz w:val="20"/>
+                <w:szCs w:val="20"/>
+              </w:rPr>
+              <w:t xml:space="preserve">N/A</w:t>
+            </w:r>
+            <w:r>
+              <w:rPr>
+                <w:rFonts w:ascii="Times New Roman" w:hAnsi="Times New Roman" w:eastAsia="Times New Roman" w:cs="Times New Roman"/>
+                <w:color w:val="000000"/>
+                <w:sz w:val="20"/>
+                <w:szCs w:val="20"/>
+              </w:rPr>
+            </w:r>
+            <w:r>
+              <w:rPr>
+                <w:rFonts w:ascii="Times New Roman" w:hAnsi="Times New Roman" w:eastAsia="Times New Roman" w:cs="Times New Roman"/>
+                <w:color w:val="000000"/>
+                <w:sz w:val="20"/>
+                <w:szCs w:val="20"/>
+                <w:highlight w:val="none"/>
+              </w:rPr>
+            </w:r>
+            <w:r>
+              <w:rPr>
+                <w:rFonts w:ascii="Times New Roman" w:hAnsi="Times New Roman" w:eastAsia="Times New Roman" w:cs="Times New Roman"/>
+                <w:color w:val="000000"/>
+                <w:sz w:val="20"/>
+                <w:szCs w:val="20"/>
+                <w:highlight w:val="none"/>
+              </w:rPr>
+            </w:r>
+            <w:r>
+              <w:rPr>
+                <w:rFonts w:ascii="Times New Roman" w:hAnsi="Times New Roman" w:eastAsia="Times New Roman" w:cs="Times New Roman"/>
+                <w:color w:val="000000"/>
+                <w:sz w:val="20"/>
+                <w:szCs w:val="20"/>
+                <w:highlight w:val="none"/>
+              </w:rPr>
+            </w:r>
+            <w:r>
+              <w:rPr>
+                <w:rFonts w:ascii="Times New Roman" w:hAnsi="Times New Roman" w:eastAsia="Times New Roman" w:cs="Times New Roman"/>
+                <w:color w:val="000000"/>
+                <w:sz w:val="20"/>
+                <w:szCs w:val="20"/>
+                <w:highlight w:val="none"/>
+              </w:rPr>
+            </w:r>
+          </w:p>
+        </w:tc>
+        <w:tc>
+          <w:tcPr>
+            <w:tcBorders/>
+            <w:tcW w:w="1276" w:type="dxa"/>
+            <w:vAlign w:val="center"/>
+            <w:vMerge w:val="restart"/>
+          </w:tcPr>
+          <w:p>
+            <w:pPr>
+              <w:pBdr/>
+              <w:spacing w:after="0" w:before="0" w:line="240" w:lineRule="auto"/>
+              <w:ind/>
+              <w:rPr>
+                <w:rFonts w:ascii="Times New Roman" w:hAnsi="Times New Roman" w:eastAsia="Times New Roman" w:cs="Times New Roman"/>
+                <w:color w:val="000000"/>
+                <w:sz w:val="20"/>
+                <w:szCs w:val="20"/>
+              </w:rPr>
+            </w:pPr>
+            <w:r>
+              <w:rPr>
+                <w:rFonts w:ascii="Times New Roman" w:hAnsi="Times New Roman" w:eastAsia="Times New Roman" w:cs="Times New Roman"/>
+                <w:color w:val="000000"/>
+                <w:sz w:val="20"/>
+                <w:szCs w:val="20"/>
+              </w:rPr>
+              <w:t xml:space="preserve">255</w:t>
+            </w:r>
+            <w:r>
+              <w:rPr>
+                <w:rFonts w:ascii="Times New Roman" w:hAnsi="Times New Roman" w:eastAsia="Times New Roman" w:cs="Times New Roman"/>
+                <w:color w:val="000000"/>
+                <w:sz w:val="20"/>
+                <w:szCs w:val="20"/>
+              </w:rPr>
+            </w:r>
+          </w:p>
+        </w:tc>
+      </w:tr>
+      <w:tr>
+        <w:trPr/>
+        <w:tc>
+          <w:tcPr>
+            <w:tcBorders/>
+            <w:tcW w:w="3401" w:type="dxa"/>
+            <w:vAlign w:val="center"/>
+            <w:vMerge w:val="restart"/>
+          </w:tcPr>
+          <w:p>
+            <w:pPr>
+              <w:pBdr/>
+              <w:spacing w:after="0" w:before="0" w:line="240" w:lineRule="auto"/>
+              <w:ind/>
+              <w:rPr>
+                <w:rFonts w:ascii="Times New Roman" w:hAnsi="Times New Roman" w:eastAsia="Times New Roman" w:cs="Times New Roman"/>
+                <w:color w:val="000000"/>
+                <w:sz w:val="20"/>
+                <w:szCs w:val="20"/>
+              </w:rPr>
+            </w:pPr>
+            <w:r>
+              <w:rPr>
+                <w:rFonts w:ascii="Times New Roman" w:hAnsi="Times New Roman" w:eastAsia="Times New Roman" w:cs="Times New Roman"/>
+                <w:color w:val="000000"/>
+                <w:sz w:val="20"/>
+                <w:szCs w:val="20"/>
+              </w:rPr>
+              <w:t xml:space="preserve">Timestamp de validade do Token </w:t>
+            </w:r>
+            <w:r>
+              <w:rPr>
+                <w:rFonts w:ascii="Times New Roman" w:hAnsi="Times New Roman" w:eastAsia="Times New Roman" w:cs="Times New Roman"/>
+                <w:color w:val="000000"/>
+                <w:sz w:val="20"/>
+                <w:szCs w:val="20"/>
+              </w:rPr>
+              <w:t xml:space="preserve">de Acesso do Usu</w:t>
+            </w:r>
+            <w:r>
+              <w:rPr>
+                <w:rFonts w:ascii="Times New Roman" w:hAnsi="Times New Roman" w:eastAsia="Times New Roman" w:cs="Times New Roman"/>
+                <w:color w:val="000000"/>
+                <w:sz w:val="20"/>
+                <w:szCs w:val="20"/>
+              </w:rPr>
+              <w:t xml:space="preserve">ário Contabilidade</w:t>
+            </w:r>
+            <w:r/>
+            <w:r>
+              <w:rPr>
+                <w:rFonts w:ascii="Times New Roman" w:hAnsi="Times New Roman" w:eastAsia="Times New Roman" w:cs="Times New Roman"/>
+                <w:color w:val="000000"/>
+                <w:sz w:val="20"/>
+                <w:szCs w:val="20"/>
+              </w:rPr>
+            </w:r>
+            <w:r>
+              <w:rPr>
+                <w:rFonts w:ascii="Times New Roman" w:hAnsi="Times New Roman" w:eastAsia="Times New Roman" w:cs="Times New Roman"/>
+                <w:color w:val="000000"/>
+                <w:sz w:val="20"/>
+                <w:szCs w:val="20"/>
+              </w:rPr>
+            </w:r>
+          </w:p>
+        </w:tc>
+        <w:tc>
+          <w:tcPr>
+            <w:tcBorders/>
+            <w:tcW w:w="2126" w:type="dxa"/>
+            <w:vAlign w:val="center"/>
+            <w:vMerge w:val="restart"/>
+          </w:tcPr>
+          <w:p>
+            <w:pPr>
+              <w:pBdr/>
+              <w:spacing w:after="0" w:before="0" w:line="240" w:lineRule="auto"/>
+              <w:ind/>
+              <w:rPr>
+                <w:rFonts w:ascii="Times New Roman" w:hAnsi="Times New Roman" w:eastAsia="Times New Roman" w:cs="Times New Roman"/>
+                <w:color w:val="000000"/>
+                <w:sz w:val="20"/>
+                <w:szCs w:val="20"/>
+              </w:rPr>
+            </w:pPr>
+            <w:r>
+              <w:rPr>
+                <w:rFonts w:ascii="Times New Roman" w:hAnsi="Times New Roman" w:eastAsia="Times New Roman" w:cs="Times New Roman"/>
+                <w:color w:val="000000"/>
+                <w:sz w:val="20"/>
+                <w:szCs w:val="20"/>
+              </w:rPr>
+            </w:r>
+            <w:r>
+              <w:rPr>
+                <w:rFonts w:ascii="Times New Roman" w:hAnsi="Times New Roman" w:eastAsia="Times New Roman" w:cs="Times New Roman"/>
+                <w:color w:val="000000"/>
+                <w:sz w:val="20"/>
+                <w:szCs w:val="20"/>
+              </w:rPr>
+              <w:t xml:space="preserve">accountingusertimestamp</w:t>
+            </w:r>
+            <w:r>
+              <w:rPr>
+                <w:rFonts w:ascii="Times New Roman" w:hAnsi="Times New Roman" w:eastAsia="Times New Roman" w:cs="Times New Roman"/>
+                <w:color w:val="000000"/>
+                <w:sz w:val="20"/>
+                <w:szCs w:val="20"/>
+              </w:rPr>
+            </w:r>
+            <w:r>
+              <w:rPr>
+                <w:rFonts w:ascii="Times New Roman" w:hAnsi="Times New Roman" w:eastAsia="Times New Roman" w:cs="Times New Roman"/>
+                <w:color w:val="000000"/>
+                <w:sz w:val="20"/>
+                <w:szCs w:val="20"/>
+              </w:rPr>
+            </w:r>
+          </w:p>
+        </w:tc>
+        <w:tc>
+          <w:tcPr>
+            <w:tcBorders/>
+            <w:tcW w:w="992" w:type="dxa"/>
+            <w:vAlign w:val="center"/>
+            <w:vMerge w:val="restart"/>
+          </w:tcPr>
+          <w:p>
+            <w:pPr>
+              <w:pBdr/>
+              <w:spacing w:after="0" w:before="0" w:line="240" w:lineRule="auto"/>
+              <w:ind/>
+              <w:rPr>
+                <w:rFonts w:ascii="Times New Roman" w:hAnsi="Times New Roman" w:eastAsia="Times New Roman" w:cs="Times New Roman"/>
+                <w:color w:val="000000"/>
+                <w:sz w:val="20"/>
+                <w:szCs w:val="20"/>
+              </w:rPr>
+            </w:pPr>
+            <w:r>
+              <w:rPr>
+                <w:rFonts w:ascii="Times New Roman" w:hAnsi="Times New Roman" w:eastAsia="Times New Roman" w:cs="Times New Roman"/>
+                <w:color w:val="000000"/>
+                <w:sz w:val="20"/>
+                <w:szCs w:val="20"/>
+              </w:rPr>
+              <w:t xml:space="preserve">DateTime</w:t>
+            </w:r>
+            <w:r>
+              <w:rPr>
+                <w:rFonts w:ascii="Times New Roman" w:hAnsi="Times New Roman" w:eastAsia="Times New Roman" w:cs="Times New Roman"/>
+                <w:color w:val="000000"/>
+                <w:sz w:val="20"/>
+                <w:szCs w:val="20"/>
+              </w:rPr>
+            </w:r>
+          </w:p>
+        </w:tc>
+        <w:tc>
+          <w:tcPr>
+            <w:tcBorders/>
+            <w:tcW w:w="1701" w:type="dxa"/>
+            <w:vAlign w:val="center"/>
+            <w:vMerge w:val="restart"/>
+          </w:tcPr>
+          <w:p>
+            <w:pPr>
+              <w:pBdr/>
+              <w:spacing w:after="0" w:before="0" w:line="240" w:lineRule="auto"/>
+              <w:ind/>
+              <w:rPr>
+                <w:rFonts w:ascii="Times New Roman" w:hAnsi="Times New Roman" w:eastAsia="Times New Roman" w:cs="Times New Roman"/>
+                <w:sz w:val="20"/>
+                <w:szCs w:val="20"/>
+              </w:rPr>
+            </w:pPr>
+            <w:r>
+              <w:rPr>
+                <w:rFonts w:ascii="Times New Roman" w:hAnsi="Times New Roman" w:eastAsia="Times New Roman" w:cs="Times New Roman"/>
+                <w:sz w:val="20"/>
+                <w:szCs w:val="20"/>
+              </w:rPr>
+              <w:t xml:space="preserve">Sim</w:t>
+            </w:r>
+            <w:r>
+              <w:rPr>
+                <w:rFonts w:ascii="Times New Roman" w:hAnsi="Times New Roman" w:eastAsia="Times New Roman" w:cs="Times New Roman"/>
+                <w:sz w:val="20"/>
+                <w:szCs w:val="20"/>
+              </w:rPr>
+            </w:r>
+          </w:p>
+        </w:tc>
+        <w:tc>
+          <w:tcPr>
+            <w:tcBorders/>
+            <w:tcW w:w="1134" w:type="dxa"/>
+            <w:vAlign w:val="center"/>
+            <w:vMerge w:val="restart"/>
+          </w:tcPr>
+          <w:p>
+            <w:pPr>
+              <w:pBdr/>
+              <w:spacing w:after="0" w:before="0" w:line="240" w:lineRule="auto"/>
+              <w:ind/>
+              <w:rPr>
+                <w:rFonts w:ascii="Times New Roman" w:hAnsi="Times New Roman" w:eastAsia="Times New Roman" w:cs="Times New Roman"/>
+                <w:color w:val="000000"/>
+                <w:sz w:val="20"/>
+                <w:szCs w:val="20"/>
+              </w:rPr>
+            </w:pPr>
+            <w:r>
+              <w:rPr>
+                <w:rFonts w:ascii="Times New Roman" w:hAnsi="Times New Roman" w:eastAsia="Times New Roman" w:cs="Times New Roman"/>
+                <w:color w:val="000000"/>
+                <w:sz w:val="20"/>
+                <w:szCs w:val="20"/>
+              </w:rPr>
+            </w:r>
+            <w:r>
+              <w:rPr>
+                <w:rFonts w:ascii="Times New Roman" w:hAnsi="Times New Roman" w:eastAsia="Times New Roman" w:cs="Times New Roman"/>
+                <w:color w:val="000000"/>
+                <w:sz w:val="20"/>
+                <w:szCs w:val="20"/>
+              </w:rPr>
+              <w:t xml:space="preserve">N/A</w:t>
+            </w:r>
+            <w:r/>
+            <w:r>
+              <w:rPr>
+                <w:rFonts w:ascii="Times New Roman" w:hAnsi="Times New Roman" w:eastAsia="Times New Roman" w:cs="Times New Roman"/>
+                <w:color w:val="000000"/>
+                <w:sz w:val="20"/>
+                <w:szCs w:val="20"/>
+              </w:rPr>
+            </w:r>
+            <w:r>
+              <w:rPr>
+                <w:rFonts w:ascii="Times New Roman" w:hAnsi="Times New Roman" w:eastAsia="Times New Roman" w:cs="Times New Roman"/>
+                <w:color w:val="000000"/>
+                <w:sz w:val="20"/>
+                <w:szCs w:val="20"/>
+              </w:rPr>
+            </w:r>
+          </w:p>
+        </w:tc>
+        <w:tc>
+          <w:tcPr>
+            <w:tcBorders/>
+            <w:tcW w:w="1276" w:type="dxa"/>
+            <w:vAlign w:val="center"/>
+            <w:vMerge w:val="restart"/>
+          </w:tcPr>
+          <w:p>
+            <w:pPr>
+              <w:pBdr/>
+              <w:spacing w:after="0" w:before="0" w:line="240" w:lineRule="auto"/>
+              <w:ind/>
+              <w:rPr>
+                <w:rFonts w:ascii="Times New Roman" w:hAnsi="Times New Roman" w:eastAsia="Times New Roman" w:cs="Times New Roman"/>
+                <w:color w:val="000000"/>
+                <w:sz w:val="20"/>
+                <w:szCs w:val="20"/>
+              </w:rPr>
+            </w:pPr>
+            <w:r>
+              <w:rPr>
+                <w:rFonts w:ascii="Times New Roman" w:hAnsi="Times New Roman" w:eastAsia="Times New Roman" w:cs="Times New Roman"/>
+                <w:color w:val="000000"/>
+                <w:sz w:val="20"/>
+                <w:szCs w:val="20"/>
+              </w:rPr>
+            </w:r>
+            <w:r>
+              <w:rPr>
+                <w:rFonts w:ascii="Times New Roman" w:hAnsi="Times New Roman" w:eastAsia="Times New Roman" w:cs="Times New Roman"/>
+                <w:color w:val="000000"/>
+                <w:sz w:val="20"/>
+                <w:szCs w:val="20"/>
+              </w:rPr>
+              <w:t xml:space="preserve">N/A</w:t>
+            </w:r>
+            <w:r/>
+            <w:r>
+              <w:rPr>
+                <w:rFonts w:ascii="Times New Roman" w:hAnsi="Times New Roman" w:eastAsia="Times New Roman" w:cs="Times New Roman"/>
+                <w:color w:val="000000"/>
+                <w:sz w:val="20"/>
+                <w:szCs w:val="20"/>
+              </w:rPr>
+            </w:r>
+            <w:r>
+              <w:rPr>
+                <w:rFonts w:ascii="Times New Roman" w:hAnsi="Times New Roman" w:eastAsia="Times New Roman" w:cs="Times New Roman"/>
+                <w:color w:val="000000"/>
                 <w:sz w:val="20"/>
                 <w:szCs w:val="20"/>
               </w:rPr>
@@ -4222,7 +5066,7 @@
             </w:r>
             <w:r>
               <w:rPr>
-                <w:rFonts w:ascii="Times New Roman" w:hAnsi="Times New Roman" w:eastAsia="Times New Roman" w:cs="Times New Roman"/>
+                <w:rFonts w:ascii="Times New Roman" w:hAnsi="Times New Roman" w:cs="Times New Roman"/>
                 <w:sz w:val="20"/>
                 <w:szCs w:val="20"/>
               </w:rPr>
@@ -4265,7 +5109,7 @@
             </w:r>
             <w:r>
               <w:rPr>
-                <w:rFonts w:ascii="Times New Roman" w:hAnsi="Times New Roman" w:eastAsia="Times New Roman" w:cs="Times New Roman"/>
+                <w:rFonts w:ascii="Times New Roman" w:hAnsi="Times New Roman" w:cs="Times New Roman"/>
                 <w:sz w:val="20"/>
                 <w:szCs w:val="20"/>
               </w:rPr>
@@ -4308,7 +5152,7 @@
             </w:r>
             <w:r>
               <w:rPr>
-                <w:rFonts w:ascii="Times New Roman" w:hAnsi="Times New Roman" w:eastAsia="Times New Roman" w:cs="Times New Roman"/>
+                <w:rFonts w:ascii="Times New Roman" w:hAnsi="Times New Roman" w:cs="Times New Roman"/>
                 <w:sz w:val="20"/>
                 <w:szCs w:val="20"/>
               </w:rPr>
@@ -4351,7 +5195,7 @@
             </w:r>
             <w:r>
               <w:rPr>
-                <w:rFonts w:ascii="Times New Roman" w:hAnsi="Times New Roman" w:eastAsia="Times New Roman" w:cs="Times New Roman"/>
+                <w:rFonts w:ascii="Times New Roman" w:hAnsi="Times New Roman" w:cs="Times New Roman"/>
                 <w:sz w:val="20"/>
                 <w:szCs w:val="20"/>
               </w:rPr>
@@ -4394,7 +5238,7 @@
             </w:r>
             <w:r>
               <w:rPr>
-                <w:rFonts w:ascii="Times New Roman" w:hAnsi="Times New Roman" w:eastAsia="Times New Roman" w:cs="Times New Roman"/>
+                <w:rFonts w:ascii="Times New Roman" w:hAnsi="Times New Roman" w:cs="Times New Roman"/>
                 <w:sz w:val="20"/>
                 <w:szCs w:val="20"/>
               </w:rPr>
@@ -4437,7 +5281,7 @@
             </w:r>
             <w:r>
               <w:rPr>
-                <w:rFonts w:ascii="Times New Roman" w:hAnsi="Times New Roman" w:eastAsia="Times New Roman" w:cs="Times New Roman"/>
+                <w:rFonts w:ascii="Times New Roman" w:hAnsi="Times New Roman" w:cs="Times New Roman"/>
                 <w:sz w:val="20"/>
                 <w:szCs w:val="20"/>
               </w:rPr>
@@ -4483,25 +5327,16 @@
               </w:rPr>
               <w:t xml:space="preserve"> da Contabilidade</w:t>
             </w:r>
-            <w:r/>
-            <w:r>
-              <w:rPr>
-                <w:rFonts w:ascii="Times New Roman" w:hAnsi="Times New Roman" w:eastAsia="Times New Roman" w:cs="Times New Roman"/>
-                <w:color w:val="000000"/>
-                <w:sz w:val="20"/>
-                <w:szCs w:val="20"/>
-              </w:rPr>
-            </w:r>
-            <w:r>
-              <w:rPr>
-                <w:rFonts w:ascii="Times New Roman" w:hAnsi="Times New Roman" w:eastAsia="Times New Roman" w:cs="Times New Roman"/>
-                <w:sz w:val="20"/>
-                <w:szCs w:val="20"/>
-              </w:rPr>
-            </w:r>
-            <w:r>
-              <w:rPr>
-                <w:rFonts w:ascii="Times New Roman" w:hAnsi="Times New Roman" w:eastAsia="Times New Roman" w:cs="Times New Roman"/>
+            <w:r>
+              <w:rPr>
+                <w:rFonts w:ascii="Times New Roman" w:hAnsi="Times New Roman" w:eastAsia="Times New Roman" w:cs="Times New Roman"/>
+                <w:sz w:val="20"/>
+                <w:szCs w:val="20"/>
+              </w:rPr>
+            </w:r>
+            <w:r>
+              <w:rPr>
+                <w:rFonts w:ascii="Times New Roman" w:hAnsi="Times New Roman" w:cs="Times New Roman"/>
                 <w:sz w:val="20"/>
                 <w:szCs w:val="20"/>
               </w:rPr>
@@ -4544,7 +5379,7 @@
             </w:r>
             <w:r>
               <w:rPr>
-                <w:rFonts w:ascii="Times New Roman" w:hAnsi="Times New Roman" w:eastAsia="Times New Roman" w:cs="Times New Roman"/>
+                <w:rFonts w:ascii="Times New Roman" w:hAnsi="Times New Roman" w:cs="Times New Roman"/>
                 <w:sz w:val="20"/>
                 <w:szCs w:val="20"/>
               </w:rPr>
@@ -4587,7 +5422,7 @@
             </w:r>
             <w:r>
               <w:rPr>
-                <w:rFonts w:ascii="Times New Roman" w:hAnsi="Times New Roman" w:eastAsia="Times New Roman" w:cs="Times New Roman"/>
+                <w:rFonts w:ascii="Times New Roman" w:hAnsi="Times New Roman" w:cs="Times New Roman"/>
                 <w:sz w:val="20"/>
                 <w:szCs w:val="20"/>
               </w:rPr>
@@ -4630,7 +5465,7 @@
             </w:r>
             <w:r>
               <w:rPr>
-                <w:rFonts w:ascii="Times New Roman" w:hAnsi="Times New Roman" w:eastAsia="Times New Roman" w:cs="Times New Roman"/>
+                <w:rFonts w:ascii="Times New Roman" w:hAnsi="Times New Roman" w:cs="Times New Roman"/>
                 <w:sz w:val="20"/>
                 <w:szCs w:val="20"/>
               </w:rPr>
@@ -4673,7 +5508,7 @@
             </w:r>
             <w:r>
               <w:rPr>
-                <w:rFonts w:ascii="Times New Roman" w:hAnsi="Times New Roman" w:eastAsia="Times New Roman" w:cs="Times New Roman"/>
+                <w:rFonts w:ascii="Times New Roman" w:hAnsi="Times New Roman" w:cs="Times New Roman"/>
                 <w:sz w:val="20"/>
                 <w:szCs w:val="20"/>
               </w:rPr>
@@ -4716,7 +5551,7 @@
             </w:r>
             <w:r>
               <w:rPr>
-                <w:rFonts w:ascii="Times New Roman" w:hAnsi="Times New Roman" w:eastAsia="Times New Roman" w:cs="Times New Roman"/>
+                <w:rFonts w:ascii="Times New Roman" w:hAnsi="Times New Roman" w:cs="Times New Roman"/>
                 <w:sz w:val="20"/>
                 <w:szCs w:val="20"/>
               </w:rPr>
@@ -4762,25 +5597,16 @@
               </w:rPr>
               <w:t xml:space="preserve"> da Contabilidade</w:t>
             </w:r>
-            <w:r/>
-            <w:r>
-              <w:rPr>
-                <w:rFonts w:ascii="Times New Roman" w:hAnsi="Times New Roman" w:eastAsia="Times New Roman" w:cs="Times New Roman"/>
-                <w:color w:val="000000"/>
-                <w:sz w:val="20"/>
-                <w:szCs w:val="20"/>
-              </w:rPr>
-            </w:r>
-            <w:r>
-              <w:rPr>
-                <w:rFonts w:ascii="Times New Roman" w:hAnsi="Times New Roman" w:eastAsia="Times New Roman" w:cs="Times New Roman"/>
-                <w:sz w:val="20"/>
-                <w:szCs w:val="20"/>
-              </w:rPr>
-            </w:r>
-            <w:r>
-              <w:rPr>
-                <w:rFonts w:ascii="Times New Roman" w:hAnsi="Times New Roman" w:eastAsia="Times New Roman" w:cs="Times New Roman"/>
+            <w:r>
+              <w:rPr>
+                <w:rFonts w:ascii="Times New Roman" w:hAnsi="Times New Roman" w:eastAsia="Times New Roman" w:cs="Times New Roman"/>
+                <w:sz w:val="20"/>
+                <w:szCs w:val="20"/>
+              </w:rPr>
+            </w:r>
+            <w:r>
+              <w:rPr>
+                <w:rFonts w:ascii="Times New Roman" w:hAnsi="Times New Roman" w:cs="Times New Roman"/>
                 <w:sz w:val="20"/>
                 <w:szCs w:val="20"/>
               </w:rPr>
@@ -4823,7 +5649,7 @@
             </w:r>
             <w:r>
               <w:rPr>
-                <w:rFonts w:ascii="Times New Roman" w:hAnsi="Times New Roman" w:eastAsia="Times New Roman" w:cs="Times New Roman"/>
+                <w:rFonts w:ascii="Times New Roman" w:hAnsi="Times New Roman" w:cs="Times New Roman"/>
                 <w:sz w:val="20"/>
                 <w:szCs w:val="20"/>
               </w:rPr>
@@ -4866,7 +5692,7 @@
             </w:r>
             <w:r>
               <w:rPr>
-                <w:rFonts w:ascii="Times New Roman" w:hAnsi="Times New Roman" w:eastAsia="Times New Roman" w:cs="Times New Roman"/>
+                <w:rFonts w:ascii="Times New Roman" w:hAnsi="Times New Roman" w:cs="Times New Roman"/>
                 <w:sz w:val="20"/>
                 <w:szCs w:val="20"/>
               </w:rPr>
@@ -4909,7 +5735,7 @@
             </w:r>
             <w:r>
               <w:rPr>
-                <w:rFonts w:ascii="Times New Roman" w:hAnsi="Times New Roman" w:eastAsia="Times New Roman" w:cs="Times New Roman"/>
+                <w:rFonts w:ascii="Times New Roman" w:hAnsi="Times New Roman" w:cs="Times New Roman"/>
                 <w:sz w:val="20"/>
                 <w:szCs w:val="20"/>
               </w:rPr>
@@ -4952,7 +5778,7 @@
             </w:r>
             <w:r>
               <w:rPr>
-                <w:rFonts w:ascii="Times New Roman" w:hAnsi="Times New Roman" w:eastAsia="Times New Roman" w:cs="Times New Roman"/>
+                <w:rFonts w:ascii="Times New Roman" w:hAnsi="Times New Roman" w:cs="Times New Roman"/>
                 <w:sz w:val="20"/>
                 <w:szCs w:val="20"/>
               </w:rPr>
@@ -4995,7 +5821,7 @@
             </w:r>
             <w:r>
               <w:rPr>
-                <w:rFonts w:ascii="Times New Roman" w:hAnsi="Times New Roman" w:eastAsia="Times New Roman" w:cs="Times New Roman"/>
+                <w:rFonts w:ascii="Times New Roman" w:hAnsi="Times New Roman" w:cs="Times New Roman"/>
                 <w:sz w:val="20"/>
                 <w:szCs w:val="20"/>
               </w:rPr>
@@ -5043,25 +5869,16 @@
               </w:rPr>
               <w:t xml:space="preserve"> da Contabilidade</w:t>
             </w:r>
-            <w:r/>
-            <w:r>
-              <w:rPr>
-                <w:rFonts w:ascii="Times New Roman" w:hAnsi="Times New Roman" w:eastAsia="Times New Roman" w:cs="Times New Roman"/>
-                <w:color w:val="000000"/>
-                <w:sz w:val="20"/>
-                <w:szCs w:val="20"/>
-              </w:rPr>
-            </w:r>
-            <w:r>
-              <w:rPr>
-                <w:rFonts w:ascii="Times New Roman" w:hAnsi="Times New Roman" w:eastAsia="Times New Roman" w:cs="Times New Roman"/>
-                <w:sz w:val="20"/>
-                <w:szCs w:val="20"/>
-              </w:rPr>
-            </w:r>
-            <w:r>
-              <w:rPr>
-                <w:rFonts w:ascii="Times New Roman" w:hAnsi="Times New Roman" w:eastAsia="Times New Roman" w:cs="Times New Roman"/>
+            <w:r>
+              <w:rPr>
+                <w:rFonts w:ascii="Times New Roman" w:hAnsi="Times New Roman" w:eastAsia="Times New Roman" w:cs="Times New Roman"/>
+                <w:sz w:val="20"/>
+                <w:szCs w:val="20"/>
+              </w:rPr>
+            </w:r>
+            <w:r>
+              <w:rPr>
+                <w:rFonts w:ascii="Times New Roman" w:hAnsi="Times New Roman" w:cs="Times New Roman"/>
                 <w:sz w:val="20"/>
                 <w:szCs w:val="20"/>
               </w:rPr>
@@ -5104,7 +5921,7 @@
             </w:r>
             <w:r>
               <w:rPr>
-                <w:rFonts w:ascii="Times New Roman" w:hAnsi="Times New Roman" w:eastAsia="Times New Roman" w:cs="Times New Roman"/>
+                <w:rFonts w:ascii="Times New Roman" w:hAnsi="Times New Roman" w:cs="Times New Roman"/>
                 <w:sz w:val="20"/>
                 <w:szCs w:val="20"/>
               </w:rPr>
@@ -5147,7 +5964,7 @@
             </w:r>
             <w:r>
               <w:rPr>
-                <w:rFonts w:ascii="Times New Roman" w:hAnsi="Times New Roman" w:eastAsia="Times New Roman" w:cs="Times New Roman"/>
+                <w:rFonts w:ascii="Times New Roman" w:hAnsi="Times New Roman" w:cs="Times New Roman"/>
                 <w:sz w:val="20"/>
                 <w:szCs w:val="20"/>
               </w:rPr>
@@ -5190,7 +6007,7 @@
             </w:r>
             <w:r>
               <w:rPr>
-                <w:rFonts w:ascii="Times New Roman" w:hAnsi="Times New Roman" w:eastAsia="Times New Roman" w:cs="Times New Roman"/>
+                <w:rFonts w:ascii="Times New Roman" w:hAnsi="Times New Roman" w:cs="Times New Roman"/>
                 <w:sz w:val="20"/>
                 <w:szCs w:val="20"/>
               </w:rPr>
@@ -5233,7 +6050,7 @@
             </w:r>
             <w:r>
               <w:rPr>
-                <w:rFonts w:ascii="Times New Roman" w:hAnsi="Times New Roman" w:eastAsia="Times New Roman" w:cs="Times New Roman"/>
+                <w:rFonts w:ascii="Times New Roman" w:hAnsi="Times New Roman" w:cs="Times New Roman"/>
                 <w:sz w:val="20"/>
                 <w:szCs w:val="20"/>
               </w:rPr>
@@ -5276,7 +6093,7 @@
             </w:r>
             <w:r>
               <w:rPr>
-                <w:rFonts w:ascii="Times New Roman" w:hAnsi="Times New Roman" w:eastAsia="Times New Roman" w:cs="Times New Roman"/>
+                <w:rFonts w:ascii="Times New Roman" w:hAnsi="Times New Roman" w:cs="Times New Roman"/>
                 <w:sz w:val="20"/>
                 <w:szCs w:val="20"/>
               </w:rPr>
@@ -5322,25 +6139,16 @@
               </w:rPr>
               <w:t xml:space="preserve"> da Contabilidade</w:t>
             </w:r>
-            <w:r/>
-            <w:r>
-              <w:rPr>
-                <w:rFonts w:ascii="Times New Roman" w:hAnsi="Times New Roman" w:eastAsia="Times New Roman" w:cs="Times New Roman"/>
-                <w:color w:val="000000"/>
-                <w:sz w:val="20"/>
-                <w:szCs w:val="20"/>
-              </w:rPr>
-            </w:r>
-            <w:r>
-              <w:rPr>
-                <w:rFonts w:ascii="Times New Roman" w:hAnsi="Times New Roman" w:eastAsia="Times New Roman" w:cs="Times New Roman"/>
-                <w:sz w:val="20"/>
-                <w:szCs w:val="20"/>
-              </w:rPr>
-            </w:r>
-            <w:r>
-              <w:rPr>
-                <w:rFonts w:ascii="Times New Roman" w:hAnsi="Times New Roman" w:eastAsia="Times New Roman" w:cs="Times New Roman"/>
+            <w:r>
+              <w:rPr>
+                <w:rFonts w:ascii="Times New Roman" w:hAnsi="Times New Roman" w:eastAsia="Times New Roman" w:cs="Times New Roman"/>
+                <w:sz w:val="20"/>
+                <w:szCs w:val="20"/>
+              </w:rPr>
+            </w:r>
+            <w:r>
+              <w:rPr>
+                <w:rFonts w:ascii="Times New Roman" w:hAnsi="Times New Roman" w:cs="Times New Roman"/>
                 <w:sz w:val="20"/>
                 <w:szCs w:val="20"/>
               </w:rPr>
@@ -5383,7 +6191,7 @@
             </w:r>
             <w:r>
               <w:rPr>
-                <w:rFonts w:ascii="Times New Roman" w:hAnsi="Times New Roman" w:eastAsia="Times New Roman" w:cs="Times New Roman"/>
+                <w:rFonts w:ascii="Times New Roman" w:hAnsi="Times New Roman" w:cs="Times New Roman"/>
                 <w:sz w:val="20"/>
                 <w:szCs w:val="20"/>
               </w:rPr>
@@ -5426,7 +6234,7 @@
             </w:r>
             <w:r>
               <w:rPr>
-                <w:rFonts w:ascii="Times New Roman" w:hAnsi="Times New Roman" w:eastAsia="Times New Roman" w:cs="Times New Roman"/>
+                <w:rFonts w:ascii="Times New Roman" w:hAnsi="Times New Roman" w:cs="Times New Roman"/>
                 <w:sz w:val="20"/>
                 <w:szCs w:val="20"/>
               </w:rPr>
@@ -5469,7 +6277,7 @@
             </w:r>
             <w:r>
               <w:rPr>
-                <w:rFonts w:ascii="Times New Roman" w:hAnsi="Times New Roman" w:eastAsia="Times New Roman" w:cs="Times New Roman"/>
+                <w:rFonts w:ascii="Times New Roman" w:hAnsi="Times New Roman" w:cs="Times New Roman"/>
                 <w:sz w:val="20"/>
                 <w:szCs w:val="20"/>
               </w:rPr>
@@ -5512,7 +6320,7 @@
             </w:r>
             <w:r>
               <w:rPr>
-                <w:rFonts w:ascii="Times New Roman" w:hAnsi="Times New Roman" w:eastAsia="Times New Roman" w:cs="Times New Roman"/>
+                <w:rFonts w:ascii="Times New Roman" w:hAnsi="Times New Roman" w:cs="Times New Roman"/>
                 <w:sz w:val="20"/>
                 <w:szCs w:val="20"/>
               </w:rPr>
@@ -5555,7 +6363,7 @@
             </w:r>
             <w:r>
               <w:rPr>
-                <w:rFonts w:ascii="Times New Roman" w:hAnsi="Times New Roman" w:eastAsia="Times New Roman" w:cs="Times New Roman"/>
+                <w:rFonts w:ascii="Times New Roman" w:hAnsi="Times New Roman" w:cs="Times New Roman"/>
                 <w:sz w:val="20"/>
                 <w:szCs w:val="20"/>
               </w:rPr>
@@ -5613,21 +6421,13 @@
             <w:r>
               <w:rPr>
                 <w:rFonts w:ascii="Times New Roman" w:hAnsi="Times New Roman" w:eastAsia="Times New Roman" w:cs="Times New Roman"/>
-                <w:color w:val="000000"/>
-                <w:sz w:val="20"/>
-                <w:szCs w:val="20"/>
-              </w:rPr>
-            </w:r>
-            <w:r>
-              <w:rPr>
-                <w:rFonts w:ascii="Times New Roman" w:hAnsi="Times New Roman" w:eastAsia="Times New Roman" w:cs="Times New Roman"/>
-                <w:sz w:val="20"/>
-                <w:szCs w:val="20"/>
-              </w:rPr>
-            </w:r>
-            <w:r>
-              <w:rPr>
-                <w:rFonts w:ascii="Times New Roman" w:hAnsi="Times New Roman" w:eastAsia="Times New Roman" w:cs="Times New Roman"/>
+                <w:sz w:val="20"/>
+                <w:szCs w:val="20"/>
+              </w:rPr>
+            </w:r>
+            <w:r>
+              <w:rPr>
+                <w:rFonts w:ascii="Times New Roman" w:hAnsi="Times New Roman" w:cs="Times New Roman"/>
                 <w:sz w:val="20"/>
                 <w:szCs w:val="20"/>
               </w:rPr>
@@ -5670,7 +6470,7 @@
             </w:r>
             <w:r>
               <w:rPr>
-                <w:rFonts w:ascii="Times New Roman" w:hAnsi="Times New Roman" w:eastAsia="Times New Roman" w:cs="Times New Roman"/>
+                <w:rFonts w:ascii="Times New Roman" w:hAnsi="Times New Roman" w:cs="Times New Roman"/>
                 <w:sz w:val="20"/>
                 <w:szCs w:val="20"/>
               </w:rPr>
@@ -5713,7 +6513,7 @@
             </w:r>
             <w:r>
               <w:rPr>
-                <w:rFonts w:ascii="Times New Roman" w:hAnsi="Times New Roman" w:eastAsia="Times New Roman" w:cs="Times New Roman"/>
+                <w:rFonts w:ascii="Times New Roman" w:hAnsi="Times New Roman" w:cs="Times New Roman"/>
                 <w:sz w:val="20"/>
                 <w:szCs w:val="20"/>
               </w:rPr>
@@ -5756,7 +6556,7 @@
             </w:r>
             <w:r>
               <w:rPr>
-                <w:rFonts w:ascii="Times New Roman" w:hAnsi="Times New Roman" w:eastAsia="Times New Roman" w:cs="Times New Roman"/>
+                <w:rFonts w:ascii="Times New Roman" w:hAnsi="Times New Roman" w:cs="Times New Roman"/>
                 <w:sz w:val="20"/>
                 <w:szCs w:val="20"/>
               </w:rPr>
@@ -5799,7 +6599,7 @@
             </w:r>
             <w:r>
               <w:rPr>
-                <w:rFonts w:ascii="Times New Roman" w:hAnsi="Times New Roman" w:eastAsia="Times New Roman" w:cs="Times New Roman"/>
+                <w:rFonts w:ascii="Times New Roman" w:hAnsi="Times New Roman" w:cs="Times New Roman"/>
                 <w:sz w:val="20"/>
                 <w:szCs w:val="20"/>
               </w:rPr>
@@ -5842,7 +6642,647 @@
             </w:r>
             <w:r>
               <w:rPr>
-                <w:rFonts w:ascii="Times New Roman" w:hAnsi="Times New Roman" w:eastAsia="Times New Roman" w:cs="Times New Roman"/>
+                <w:rFonts w:ascii="Times New Roman" w:hAnsi="Times New Roman" w:cs="Times New Roman"/>
+                <w:sz w:val="20"/>
+                <w:szCs w:val="20"/>
+              </w:rPr>
+            </w:r>
+          </w:p>
+        </w:tc>
+      </w:tr>
+      <w:tr>
+        <w:trPr/>
+        <w:tc>
+          <w:tcPr>
+            <w:tcBorders/>
+            <w:tcW w:w="3401" w:type="dxa"/>
+            <w:vAlign w:val="center"/>
+            <w:vMerge w:val="restart"/>
+          </w:tcPr>
+          <w:p>
+            <w:pPr>
+              <w:pBdr/>
+              <w:spacing w:after="0" w:before="0" w:line="240" w:lineRule="auto"/>
+              <w:ind/>
+              <w:rPr>
+                <w:rFonts w:ascii="Times New Roman" w:hAnsi="Times New Roman" w:eastAsia="Times New Roman" w:cs="Times New Roman"/>
+                <w:color w:val="000000"/>
+                <w:sz w:val="20"/>
+                <w:szCs w:val="20"/>
+              </w:rPr>
+            </w:pPr>
+            <w:r>
+              <w:rPr>
+                <w:rFonts w:ascii="Times New Roman" w:hAnsi="Times New Roman" w:eastAsia="Times New Roman" w:cs="Times New Roman"/>
+                <w:color w:val="000000"/>
+                <w:sz w:val="20"/>
+                <w:szCs w:val="20"/>
+              </w:rPr>
+              <w:t xml:space="preserve">Token de Acesso do Usu</w:t>
+            </w:r>
+            <w:r>
+              <w:rPr>
+                <w:rFonts w:ascii="Times New Roman" w:hAnsi="Times New Roman" w:eastAsia="Times New Roman" w:cs="Times New Roman"/>
+                <w:color w:val="000000"/>
+                <w:sz w:val="20"/>
+                <w:szCs w:val="20"/>
+              </w:rPr>
+              <w:t xml:space="preserve">ário Cliente</w:t>
+            </w:r>
+            <w:r>
+              <w:rPr>
+                <w:rFonts w:ascii="Times New Roman" w:hAnsi="Times New Roman" w:eastAsia="Times New Roman" w:cs="Times New Roman"/>
+                <w:color w:val="000000"/>
+                <w:sz w:val="20"/>
+                <w:szCs w:val="20"/>
+              </w:rPr>
+            </w:r>
+            <w:r>
+              <w:rPr>
+                <w:rFonts w:ascii="Times New Roman" w:hAnsi="Times New Roman" w:eastAsia="Times New Roman" w:cs="Times New Roman"/>
+                <w:color w:val="000000"/>
+                <w:sz w:val="20"/>
+                <w:szCs w:val="20"/>
+              </w:rPr>
+            </w:r>
+          </w:p>
+        </w:tc>
+        <w:tc>
+          <w:tcPr>
+            <w:tcBorders/>
+            <w:tcW w:w="2126" w:type="dxa"/>
+            <w:vAlign w:val="center"/>
+            <w:vMerge w:val="restart"/>
+          </w:tcPr>
+          <w:p>
+            <w:pPr>
+              <w:pBdr/>
+              <w:spacing w:after="0" w:before="0" w:line="240" w:lineRule="auto"/>
+              <w:ind/>
+              <w:rPr>
+                <w:rFonts w:ascii="Times New Roman" w:hAnsi="Times New Roman" w:eastAsia="Times New Roman" w:cs="Times New Roman"/>
+                <w:color w:val="000000"/>
+                <w:sz w:val="20"/>
+                <w:szCs w:val="20"/>
+              </w:rPr>
+            </w:pPr>
+            <w:r>
+              <w:rPr>
+                <w:rFonts w:ascii="Times New Roman" w:hAnsi="Times New Roman" w:eastAsia="Times New Roman" w:cs="Times New Roman"/>
+                <w:color w:val="000000"/>
+                <w:sz w:val="20"/>
+                <w:szCs w:val="20"/>
+              </w:rPr>
+            </w:r>
+            <w:r>
+              <w:rPr>
+                <w:rFonts w:ascii="Times New Roman" w:hAnsi="Times New Roman" w:eastAsia="Times New Roman" w:cs="Times New Roman"/>
+                <w:color w:val="000000"/>
+                <w:sz w:val="20"/>
+                <w:szCs w:val="20"/>
+              </w:rPr>
+              <w:t xml:space="preserve">userclienttoken</w:t>
+            </w:r>
+            <w:r>
+              <w:rPr>
+                <w:rFonts w:ascii="Times New Roman" w:hAnsi="Times New Roman" w:eastAsia="Times New Roman" w:cs="Times New Roman"/>
+                <w:color w:val="000000"/>
+                <w:sz w:val="20"/>
+                <w:szCs w:val="20"/>
+              </w:rPr>
+            </w:r>
+            <w:r>
+              <w:rPr>
+                <w:rFonts w:ascii="Times New Roman" w:hAnsi="Times New Roman" w:eastAsia="Times New Roman" w:cs="Times New Roman"/>
+                <w:color w:val="000000"/>
+                <w:sz w:val="20"/>
+                <w:szCs w:val="20"/>
+              </w:rPr>
+            </w:r>
+          </w:p>
+        </w:tc>
+        <w:tc>
+          <w:tcPr>
+            <w:tcBorders/>
+            <w:tcW w:w="992" w:type="dxa"/>
+            <w:vAlign w:val="center"/>
+            <w:vMerge w:val="restart"/>
+          </w:tcPr>
+          <w:p>
+            <w:pPr>
+              <w:pBdr/>
+              <w:spacing w:after="0" w:before="0" w:line="240" w:lineRule="auto"/>
+              <w:ind/>
+              <w:rPr>
+                <w:rFonts w:ascii="Times New Roman" w:hAnsi="Times New Roman" w:cs="Times New Roman"/>
+                <w:sz w:val="20"/>
+                <w:szCs w:val="20"/>
+              </w:rPr>
+            </w:pPr>
+            <w:r>
+              <w:rPr>
+                <w:rFonts w:ascii="Times New Roman" w:hAnsi="Times New Roman" w:eastAsia="Times New Roman" w:cs="Times New Roman"/>
+                <w:color w:val="000000"/>
+                <w:sz w:val="20"/>
+                <w:szCs w:val="20"/>
+              </w:rPr>
+              <w:t xml:space="preserve">Varchar</w:t>
+            </w:r>
+            <w:r>
+              <w:rPr>
+                <w:rFonts w:ascii="Times New Roman" w:hAnsi="Times New Roman" w:cs="Times New Roman"/>
+                <w:sz w:val="20"/>
+                <w:szCs w:val="20"/>
+              </w:rPr>
+            </w:r>
+            <w:r>
+              <w:rPr>
+                <w:rFonts w:ascii="Times New Roman" w:hAnsi="Times New Roman" w:cs="Times New Roman"/>
+                <w:sz w:val="20"/>
+                <w:szCs w:val="20"/>
+              </w:rPr>
+            </w:r>
+            <w:r>
+              <w:rPr>
+                <w:rFonts w:ascii="Times New Roman" w:hAnsi="Times New Roman" w:eastAsia="Times New Roman" w:cs="Times New Roman"/>
+                <w:color w:val="000000"/>
+                <w:sz w:val="20"/>
+                <w:szCs w:val="20"/>
+              </w:rPr>
+            </w:r>
+            <w:r>
+              <w:rPr>
+                <w:rFonts w:ascii="Times New Roman" w:hAnsi="Times New Roman" w:eastAsia="Times New Roman" w:cs="Times New Roman"/>
+                <w:color w:val="000000"/>
+                <w:sz w:val="20"/>
+                <w:szCs w:val="20"/>
+              </w:rPr>
+            </w:r>
+            <w:r>
+              <w:rPr>
+                <w:rFonts w:ascii="Times New Roman" w:hAnsi="Times New Roman" w:cs="Times New Roman"/>
+                <w:sz w:val="20"/>
+                <w:szCs w:val="20"/>
+              </w:rPr>
+            </w:r>
+          </w:p>
+        </w:tc>
+        <w:tc>
+          <w:tcPr>
+            <w:tcBorders/>
+            <w:tcW w:w="1701" w:type="dxa"/>
+            <w:vAlign w:val="center"/>
+            <w:vMerge w:val="restart"/>
+          </w:tcPr>
+          <w:p>
+            <w:pPr>
+              <w:pBdr/>
+              <w:spacing w:after="0" w:before="0" w:line="240" w:lineRule="auto"/>
+              <w:ind/>
+              <w:rPr>
+                <w:rFonts w:ascii="Times New Roman" w:hAnsi="Times New Roman" w:eastAsia="Times New Roman" w:cs="Times New Roman"/>
+                <w:color w:val="000000"/>
+                <w:sz w:val="20"/>
+                <w:szCs w:val="20"/>
+              </w:rPr>
+            </w:pPr>
+            <w:r>
+              <w:rPr>
+                <w:rFonts w:ascii="Times New Roman" w:hAnsi="Times New Roman" w:eastAsia="Times New Roman" w:cs="Times New Roman"/>
+                <w:color w:val="000000"/>
+                <w:sz w:val="20"/>
+                <w:szCs w:val="20"/>
+              </w:rPr>
+              <w:t xml:space="preserve">Sim</w:t>
+            </w:r>
+            <w:r>
+              <w:rPr>
+                <w:rFonts w:ascii="Times New Roman" w:hAnsi="Times New Roman" w:eastAsia="Times New Roman" w:cs="Times New Roman"/>
+                <w:color w:val="000000"/>
+                <w:sz w:val="20"/>
+                <w:szCs w:val="20"/>
+              </w:rPr>
+            </w:r>
+          </w:p>
+        </w:tc>
+        <w:tc>
+          <w:tcPr>
+            <w:tcBorders/>
+            <w:tcW w:w="1134" w:type="dxa"/>
+            <w:vAlign w:val="center"/>
+            <w:vMerge w:val="restart"/>
+          </w:tcPr>
+          <w:p>
+            <w:pPr>
+              <w:pBdr/>
+              <w:spacing w:after="0" w:before="0" w:line="240" w:lineRule="auto"/>
+              <w:ind/>
+              <w:rPr>
+                <w:rFonts w:ascii="Times New Roman" w:hAnsi="Times New Roman" w:eastAsia="Times New Roman" w:cs="Times New Roman"/>
+                <w:color w:val="000000"/>
+                <w:sz w:val="20"/>
+                <w:szCs w:val="20"/>
+              </w:rPr>
+            </w:pPr>
+            <w:r>
+              <w:rPr>
+                <w:rFonts w:ascii="Times New Roman" w:hAnsi="Times New Roman" w:eastAsia="Times New Roman" w:cs="Times New Roman"/>
+                <w:color w:val="000000"/>
+                <w:sz w:val="20"/>
+                <w:szCs w:val="20"/>
+              </w:rPr>
+            </w:r>
+            <w:r>
+              <w:rPr>
+                <w:rFonts w:ascii="Times New Roman" w:hAnsi="Times New Roman" w:eastAsia="Times New Roman" w:cs="Times New Roman"/>
+                <w:color w:val="000000"/>
+                <w:sz w:val="20"/>
+                <w:szCs w:val="20"/>
+              </w:rPr>
+              <w:t xml:space="preserve">N/A</w:t>
+            </w:r>
+            <w:r/>
+            <w:r>
+              <w:rPr>
+                <w:rFonts w:ascii="Times New Roman" w:hAnsi="Times New Roman" w:eastAsia="Times New Roman" w:cs="Times New Roman"/>
+                <w:color w:val="000000"/>
+                <w:sz w:val="20"/>
+                <w:szCs w:val="20"/>
+              </w:rPr>
+            </w:r>
+            <w:r>
+              <w:rPr>
+                <w:rFonts w:ascii="Times New Roman" w:hAnsi="Times New Roman" w:eastAsia="Times New Roman" w:cs="Times New Roman"/>
+                <w:color w:val="000000"/>
+                <w:sz w:val="20"/>
+                <w:szCs w:val="20"/>
+              </w:rPr>
+            </w:r>
+          </w:p>
+        </w:tc>
+        <w:tc>
+          <w:tcPr>
+            <w:tcBorders/>
+            <w:tcW w:w="1276" w:type="dxa"/>
+            <w:vAlign w:val="center"/>
+            <w:vMerge w:val="restart"/>
+          </w:tcPr>
+          <w:p>
+            <w:pPr>
+              <w:pBdr/>
+              <w:spacing w:after="0" w:before="0" w:line="240" w:lineRule="auto"/>
+              <w:ind/>
+              <w:rPr>
+                <w:rFonts w:ascii="Times New Roman" w:hAnsi="Times New Roman" w:eastAsia="Times New Roman" w:cs="Times New Roman"/>
+                <w:color w:val="000000"/>
+                <w:sz w:val="20"/>
+                <w:szCs w:val="20"/>
+              </w:rPr>
+            </w:pPr>
+            <w:r>
+              <w:rPr>
+                <w:rFonts w:ascii="Times New Roman" w:hAnsi="Times New Roman" w:eastAsia="Times New Roman" w:cs="Times New Roman"/>
+                <w:color w:val="000000"/>
+                <w:sz w:val="20"/>
+                <w:szCs w:val="20"/>
+              </w:rPr>
+              <w:t xml:space="preserve">255</w:t>
+            </w:r>
+            <w:r>
+              <w:rPr>
+                <w:rFonts w:ascii="Times New Roman" w:hAnsi="Times New Roman" w:eastAsia="Times New Roman" w:cs="Times New Roman"/>
+                <w:color w:val="000000"/>
+                <w:sz w:val="20"/>
+                <w:szCs w:val="20"/>
+              </w:rPr>
+            </w:r>
+          </w:p>
+        </w:tc>
+      </w:tr>
+      <w:tr>
+        <w:trPr/>
+        <w:tc>
+          <w:tcPr>
+            <w:tcBorders/>
+            <w:tcW w:w="3401" w:type="dxa"/>
+            <w:vAlign w:val="center"/>
+            <w:vMerge w:val="restart"/>
+          </w:tcPr>
+          <w:p>
+            <w:pPr>
+              <w:pBdr/>
+              <w:spacing w:after="0" w:before="0" w:line="240" w:lineRule="auto"/>
+              <w:ind/>
+              <w:rPr>
+                <w:rFonts w:ascii="Times New Roman" w:hAnsi="Times New Roman" w:eastAsia="Times New Roman" w:cs="Times New Roman"/>
+                <w:color w:val="000000"/>
+                <w:sz w:val="20"/>
+                <w:szCs w:val="20"/>
+              </w:rPr>
+            </w:pPr>
+            <w:r>
+              <w:rPr>
+                <w:rFonts w:ascii="Times New Roman" w:hAnsi="Times New Roman" w:eastAsia="Times New Roman" w:cs="Times New Roman"/>
+                <w:color w:val="000000"/>
+                <w:sz w:val="20"/>
+                <w:szCs w:val="20"/>
+              </w:rPr>
+              <w:t xml:space="preserve">Timestamp de validade do Token </w:t>
+            </w:r>
+            <w:r>
+              <w:rPr>
+                <w:rFonts w:ascii="Times New Roman" w:hAnsi="Times New Roman" w:eastAsia="Times New Roman" w:cs="Times New Roman"/>
+                <w:color w:val="000000"/>
+                <w:sz w:val="20"/>
+                <w:szCs w:val="20"/>
+              </w:rPr>
+              <w:t xml:space="preserve">de Acesso do Usu</w:t>
+            </w:r>
+            <w:r>
+              <w:rPr>
+                <w:rFonts w:ascii="Times New Roman" w:hAnsi="Times New Roman" w:eastAsia="Times New Roman" w:cs="Times New Roman"/>
+                <w:color w:val="000000"/>
+                <w:sz w:val="20"/>
+                <w:szCs w:val="20"/>
+              </w:rPr>
+              <w:t xml:space="preserve">ário Cliente</w:t>
+            </w:r>
+            <w:r>
+              <w:rPr>
+                <w:rFonts w:ascii="Times New Roman" w:hAnsi="Times New Roman" w:eastAsia="Times New Roman" w:cs="Times New Roman"/>
+                <w:color w:val="000000"/>
+                <w:sz w:val="20"/>
+                <w:szCs w:val="20"/>
+              </w:rPr>
+            </w:r>
+          </w:p>
+        </w:tc>
+        <w:tc>
+          <w:tcPr>
+            <w:tcBorders/>
+            <w:tcW w:w="2126" w:type="dxa"/>
+            <w:vAlign w:val="center"/>
+            <w:vMerge w:val="restart"/>
+          </w:tcPr>
+          <w:p>
+            <w:pPr>
+              <w:pBdr/>
+              <w:spacing w:after="0" w:before="0" w:line="240" w:lineRule="auto"/>
+              <w:ind/>
+              <w:rPr>
+                <w:rFonts w:ascii="Times New Roman" w:hAnsi="Times New Roman" w:eastAsia="Times New Roman" w:cs="Times New Roman"/>
+                <w:color w:val="000000"/>
+                <w:sz w:val="20"/>
+                <w:szCs w:val="20"/>
+              </w:rPr>
+            </w:pPr>
+            <w:r>
+              <w:rPr>
+                <w:rFonts w:ascii="Times New Roman" w:hAnsi="Times New Roman" w:eastAsia="Times New Roman" w:cs="Times New Roman"/>
+                <w:color w:val="000000"/>
+                <w:sz w:val="20"/>
+                <w:szCs w:val="20"/>
+              </w:rPr>
+            </w:r>
+            <w:r>
+              <w:rPr>
+                <w:rFonts w:ascii="Times New Roman" w:hAnsi="Times New Roman" w:eastAsia="Times New Roman" w:cs="Times New Roman"/>
+                <w:color w:val="000000"/>
+                <w:sz w:val="20"/>
+                <w:szCs w:val="20"/>
+              </w:rPr>
+              <w:t xml:space="preserve">userclienttimestamp</w:t>
+            </w:r>
+            <w:r>
+              <w:rPr>
+                <w:rFonts w:ascii="Times New Roman" w:hAnsi="Times New Roman" w:eastAsia="Times New Roman" w:cs="Times New Roman"/>
+                <w:color w:val="000000"/>
+                <w:sz w:val="20"/>
+                <w:szCs w:val="20"/>
+              </w:rPr>
+            </w:r>
+            <w:r>
+              <w:rPr>
+                <w:rFonts w:ascii="Times New Roman" w:hAnsi="Times New Roman" w:eastAsia="Times New Roman" w:cs="Times New Roman"/>
+                <w:color w:val="000000"/>
+                <w:sz w:val="20"/>
+                <w:szCs w:val="20"/>
+              </w:rPr>
+            </w:r>
+          </w:p>
+        </w:tc>
+        <w:tc>
+          <w:tcPr>
+            <w:tcBorders/>
+            <w:tcW w:w="992" w:type="dxa"/>
+            <w:vAlign w:val="center"/>
+            <w:vMerge w:val="restart"/>
+          </w:tcPr>
+          <w:p>
+            <w:pPr>
+              <w:pBdr/>
+              <w:spacing w:after="0" w:before="0" w:line="240" w:lineRule="auto"/>
+              <w:ind/>
+              <w:rPr>
+                <w:rFonts w:ascii="Times New Roman" w:hAnsi="Times New Roman" w:eastAsia="Times New Roman" w:cs="Times New Roman"/>
+                <w:color w:val="000000"/>
+                <w:sz w:val="20"/>
+                <w:szCs w:val="20"/>
+              </w:rPr>
+            </w:pPr>
+            <w:r>
+              <w:rPr>
+                <w:rFonts w:ascii="Times New Roman" w:hAnsi="Times New Roman" w:eastAsia="Times New Roman" w:cs="Times New Roman"/>
+                <w:color w:val="000000"/>
+                <w:sz w:val="20"/>
+                <w:szCs w:val="20"/>
+              </w:rPr>
+              <w:t xml:space="preserve">DateTime</w:t>
+            </w:r>
+            <w:r>
+              <w:rPr>
+                <w:rFonts w:ascii="Times New Roman" w:hAnsi="Times New Roman" w:eastAsia="Times New Roman" w:cs="Times New Roman"/>
+                <w:color w:val="000000"/>
+                <w:sz w:val="20"/>
+                <w:szCs w:val="20"/>
+              </w:rPr>
+            </w:r>
+            <w:r>
+              <w:rPr>
+                <w:rFonts w:ascii="Times New Roman" w:hAnsi="Times New Roman" w:eastAsia="Times New Roman" w:cs="Times New Roman"/>
+                <w:color w:val="000000"/>
+                <w:sz w:val="20"/>
+                <w:szCs w:val="20"/>
+              </w:rPr>
+            </w:r>
+            <w:r>
+              <w:rPr>
+                <w:rFonts w:ascii="Times New Roman" w:hAnsi="Times New Roman" w:eastAsia="Times New Roman" w:cs="Times New Roman"/>
+                <w:color w:val="000000"/>
+                <w:sz w:val="20"/>
+                <w:szCs w:val="20"/>
+              </w:rPr>
+            </w:r>
+            <w:r>
+              <w:rPr>
+                <w:rFonts w:ascii="Times New Roman" w:hAnsi="Times New Roman" w:eastAsia="Times New Roman" w:cs="Times New Roman"/>
+                <w:color w:val="000000"/>
+                <w:sz w:val="20"/>
+                <w:szCs w:val="20"/>
+              </w:rPr>
+            </w:r>
+            <w:r>
+              <w:rPr>
+                <w:rFonts w:ascii="Times New Roman" w:hAnsi="Times New Roman" w:eastAsia="Times New Roman" w:cs="Times New Roman"/>
+                <w:color w:val="000000"/>
+                <w:sz w:val="20"/>
+                <w:szCs w:val="20"/>
+              </w:rPr>
+            </w:r>
+          </w:p>
+        </w:tc>
+        <w:tc>
+          <w:tcPr>
+            <w:tcBorders/>
+            <w:tcW w:w="1701" w:type="dxa"/>
+            <w:vAlign w:val="center"/>
+            <w:vMerge w:val="restart"/>
+          </w:tcPr>
+          <w:p>
+            <w:pPr>
+              <w:pBdr/>
+              <w:spacing w:after="0" w:before="0" w:line="240" w:lineRule="auto"/>
+              <w:ind/>
+              <w:rPr>
+                <w:rFonts w:ascii="Times New Roman" w:hAnsi="Times New Roman" w:eastAsia="Times New Roman" w:cs="Times New Roman"/>
+                <w:color w:val="000000"/>
+                <w:sz w:val="20"/>
+                <w:szCs w:val="20"/>
+              </w:rPr>
+            </w:pPr>
+            <w:r>
+              <w:rPr>
+                <w:rFonts w:ascii="Times New Roman" w:hAnsi="Times New Roman" w:eastAsia="Times New Roman" w:cs="Times New Roman"/>
+                <w:color w:val="000000"/>
+                <w:sz w:val="20"/>
+                <w:szCs w:val="20"/>
+              </w:rPr>
+              <w:t xml:space="preserve">Sim</w:t>
+            </w:r>
+            <w:r>
+              <w:rPr>
+                <w:rFonts w:ascii="Times New Roman" w:hAnsi="Times New Roman" w:eastAsia="Times New Roman" w:cs="Times New Roman"/>
+                <w:color w:val="000000"/>
+                <w:sz w:val="20"/>
+                <w:szCs w:val="20"/>
+              </w:rPr>
+            </w:r>
+          </w:p>
+        </w:tc>
+        <w:tc>
+          <w:tcPr>
+            <w:tcBorders/>
+            <w:tcW w:w="1134" w:type="dxa"/>
+            <w:vAlign w:val="center"/>
+            <w:vMerge w:val="restart"/>
+          </w:tcPr>
+          <w:p>
+            <w:pPr>
+              <w:pBdr/>
+              <w:spacing w:after="0" w:before="0" w:line="240" w:lineRule="auto"/>
+              <w:ind/>
+              <w:rPr>
+                <w:rFonts w:ascii="Times New Roman" w:hAnsi="Times New Roman" w:eastAsia="Times New Roman" w:cs="Times New Roman"/>
+                <w:color w:val="000000"/>
+                <w:sz w:val="20"/>
+                <w:szCs w:val="20"/>
+              </w:rPr>
+            </w:pPr>
+            <w:r>
+              <w:rPr>
+                <w:rFonts w:ascii="Times New Roman" w:hAnsi="Times New Roman" w:eastAsia="Times New Roman" w:cs="Times New Roman"/>
+                <w:color w:val="000000"/>
+                <w:sz w:val="20"/>
+                <w:szCs w:val="20"/>
+              </w:rPr>
+            </w:r>
+            <w:r>
+              <w:rPr>
+                <w:rFonts w:ascii="Times New Roman" w:hAnsi="Times New Roman" w:eastAsia="Times New Roman" w:cs="Times New Roman"/>
+                <w:color w:val="000000"/>
+                <w:sz w:val="20"/>
+                <w:szCs w:val="20"/>
+              </w:rPr>
+              <w:t xml:space="preserve">N/A</w:t>
+            </w:r>
+            <w:r/>
+            <w:r>
+              <w:rPr>
+                <w:rFonts w:ascii="Times New Roman" w:hAnsi="Times New Roman" w:eastAsia="Times New Roman" w:cs="Times New Roman"/>
+                <w:color w:val="000000"/>
+                <w:sz w:val="20"/>
+                <w:szCs w:val="20"/>
+              </w:rPr>
+            </w:r>
+            <w:r>
+              <w:rPr>
+                <w:rFonts w:ascii="Times New Roman" w:hAnsi="Times New Roman" w:eastAsia="Times New Roman" w:cs="Times New Roman"/>
+                <w:color w:val="000000"/>
+                <w:sz w:val="20"/>
+                <w:szCs w:val="20"/>
+              </w:rPr>
+            </w:r>
+          </w:p>
+        </w:tc>
+        <w:tc>
+          <w:tcPr>
+            <w:tcBorders/>
+            <w:tcW w:w="1276" w:type="dxa"/>
+            <w:vAlign w:val="center"/>
+            <w:vMerge w:val="restart"/>
+          </w:tcPr>
+          <w:p>
+            <w:pPr>
+              <w:pBdr/>
+              <w:spacing w:after="0" w:before="0" w:line="240" w:lineRule="auto"/>
+              <w:ind/>
+              <w:rPr>
+                <w:rFonts w:ascii="Times New Roman" w:hAnsi="Times New Roman" w:eastAsia="Times New Roman" w:cs="Times New Roman"/>
+                <w:color w:val="000000"/>
+                <w:sz w:val="20"/>
+                <w:szCs w:val="20"/>
+              </w:rPr>
+            </w:pPr>
+            <w:r>
+              <w:rPr>
+                <w:rFonts w:ascii="Times New Roman" w:hAnsi="Times New Roman" w:eastAsia="Times New Roman" w:cs="Times New Roman"/>
+                <w:color w:val="000000"/>
+                <w:sz w:val="20"/>
+                <w:szCs w:val="20"/>
+              </w:rPr>
+            </w:r>
+            <w:r>
+              <w:rPr>
+                <w:rFonts w:ascii="Times New Roman" w:hAnsi="Times New Roman" w:eastAsia="Times New Roman" w:cs="Times New Roman"/>
+                <w:color w:val="000000"/>
+                <w:sz w:val="20"/>
+                <w:szCs w:val="20"/>
+              </w:rPr>
+              <w:t xml:space="preserve">N/A</w:t>
+            </w:r>
+            <w:r/>
+            <w:r>
+              <w:rPr>
+                <w:rFonts w:ascii="Times New Roman" w:hAnsi="Times New Roman" w:eastAsia="Times New Roman" w:cs="Times New Roman"/>
+                <w:color w:val="000000"/>
+                <w:sz w:val="20"/>
+                <w:szCs w:val="20"/>
+              </w:rPr>
+            </w:r>
+            <w:r>
+              <w:rPr>
+                <w:rFonts w:ascii="Times New Roman" w:hAnsi="Times New Roman" w:eastAsia="Times New Roman" w:cs="Times New Roman"/>
+                <w:color w:val="000000"/>
                 <w:sz w:val="20"/>
                 <w:szCs w:val="20"/>
               </w:rPr>
@@ -5851,6 +7291,61 @@
         </w:tc>
       </w:tr>
     </w:tbl>
+    <w:p>
+      <w:pPr>
+        <w:pBdr/>
+        <w:spacing/>
+        <w:ind/>
+        <w:rPr/>
+      </w:pPr>
+      <w:r/>
+      <w:r/>
+      <w:r/>
+    </w:p>
+    <w:p>
+      <w:pPr>
+        <w:pBdr/>
+        <w:spacing/>
+        <w:ind/>
+        <w:rPr/>
+      </w:pPr>
+      <w:r/>
+      <w:r/>
+      <w:r/>
+    </w:p>
+    <w:p>
+      <w:pPr>
+        <w:pBdr/>
+        <w:spacing/>
+        <w:ind/>
+        <w:rPr/>
+      </w:pPr>
+      <w:r/>
+      <w:r/>
+      <w:r/>
+    </w:p>
+    <w:p>
+      <w:pPr>
+        <w:pBdr/>
+        <w:spacing/>
+        <w:ind/>
+        <w:rPr/>
+      </w:pPr>
+      <w:r/>
+      <w:r/>
+      <w:r/>
+    </w:p>
+    <w:p>
+      <w:pPr>
+        <w:pBdr/>
+        <w:spacing/>
+        <w:ind/>
+        <w:rPr/>
+      </w:pPr>
+      <w:r/>
+      <w:r/>
+      <w:r/>
+    </w:p>
     <w:p>
       <w:pPr>
         <w:pBdr/>
@@ -6343,7 +7838,7 @@
             </w:r>
             <w:r>
               <w:rPr>
-                <w:rFonts w:ascii="Times New Roman" w:hAnsi="Times New Roman" w:eastAsia="Times New Roman" w:cs="Times New Roman"/>
+                <w:rFonts w:ascii="Times New Roman" w:hAnsi="Times New Roman" w:cs="Times New Roman"/>
                 <w:sz w:val="20"/>
                 <w:szCs w:val="20"/>
               </w:rPr>
@@ -6386,7 +7881,7 @@
             </w:r>
             <w:r>
               <w:rPr>
-                <w:rFonts w:ascii="Times New Roman" w:hAnsi="Times New Roman" w:eastAsia="Times New Roman" w:cs="Times New Roman"/>
+                <w:rFonts w:ascii="Times New Roman" w:hAnsi="Times New Roman" w:cs="Times New Roman"/>
                 <w:sz w:val="20"/>
                 <w:szCs w:val="20"/>
               </w:rPr>
@@ -6429,7 +7924,7 @@
             </w:r>
             <w:r>
               <w:rPr>
-                <w:rFonts w:ascii="Times New Roman" w:hAnsi="Times New Roman" w:eastAsia="Times New Roman" w:cs="Times New Roman"/>
+                <w:rFonts w:ascii="Times New Roman" w:hAnsi="Times New Roman" w:cs="Times New Roman"/>
                 <w:sz w:val="20"/>
                 <w:szCs w:val="20"/>
               </w:rPr>
@@ -6472,7 +7967,7 @@
             </w:r>
             <w:r>
               <w:rPr>
-                <w:rFonts w:ascii="Times New Roman" w:hAnsi="Times New Roman" w:eastAsia="Times New Roman" w:cs="Times New Roman"/>
+                <w:rFonts w:ascii="Times New Roman" w:hAnsi="Times New Roman" w:cs="Times New Roman"/>
                 <w:sz w:val="20"/>
                 <w:szCs w:val="20"/>
               </w:rPr>
@@ -6515,7 +8010,7 @@
             </w:r>
             <w:r>
               <w:rPr>
-                <w:rFonts w:ascii="Times New Roman" w:hAnsi="Times New Roman" w:eastAsia="Times New Roman" w:cs="Times New Roman"/>
+                <w:rFonts w:ascii="Times New Roman" w:hAnsi="Times New Roman" w:cs="Times New Roman"/>
                 <w:sz w:val="20"/>
                 <w:szCs w:val="20"/>
               </w:rPr>
@@ -6558,7 +8053,7 @@
             </w:r>
             <w:r>
               <w:rPr>
-                <w:rFonts w:ascii="Times New Roman" w:hAnsi="Times New Roman" w:eastAsia="Times New Roman" w:cs="Times New Roman"/>
+                <w:rFonts w:ascii="Times New Roman" w:hAnsi="Times New Roman" w:cs="Times New Roman"/>
                 <w:sz w:val="20"/>
                 <w:szCs w:val="20"/>
               </w:rPr>
@@ -6602,35 +8097,18 @@
                 <w:sz w:val="20"/>
                 <w:szCs w:val="20"/>
               </w:rPr>
-            </w:r>
-            <w:r>
-              <w:rPr>
-                <w:rFonts w:ascii="Times New Roman" w:hAnsi="Times New Roman" w:eastAsia="Times New Roman" w:cs="Times New Roman"/>
-                <w:color w:val="000000"/>
-                <w:sz w:val="20"/>
-                <w:szCs w:val="20"/>
-              </w:rPr>
               <w:t xml:space="preserve">da Execução do Serviço</w:t>
             </w:r>
-            <w:r/>
-            <w:r>
-              <w:rPr>
-                <w:rFonts w:ascii="Times New Roman" w:hAnsi="Times New Roman" w:eastAsia="Times New Roman" w:cs="Times New Roman"/>
-                <w:color w:val="000000"/>
-                <w:sz w:val="20"/>
-                <w:szCs w:val="20"/>
-              </w:rPr>
-            </w:r>
-            <w:r>
-              <w:rPr>
-                <w:rFonts w:ascii="Times New Roman" w:hAnsi="Times New Roman" w:eastAsia="Times New Roman" w:cs="Times New Roman"/>
-                <w:sz w:val="20"/>
-                <w:szCs w:val="20"/>
-              </w:rPr>
-            </w:r>
-            <w:r>
-              <w:rPr>
-                <w:rFonts w:ascii="Times New Roman" w:hAnsi="Times New Roman" w:eastAsia="Times New Roman" w:cs="Times New Roman"/>
+            <w:r>
+              <w:rPr>
+                <w:rFonts w:ascii="Times New Roman" w:hAnsi="Times New Roman" w:eastAsia="Times New Roman" w:cs="Times New Roman"/>
+                <w:sz w:val="20"/>
+                <w:szCs w:val="20"/>
+              </w:rPr>
+            </w:r>
+            <w:r>
+              <w:rPr>
+                <w:rFonts w:ascii="Times New Roman" w:hAnsi="Times New Roman" w:cs="Times New Roman"/>
                 <w:sz w:val="20"/>
                 <w:szCs w:val="20"/>
               </w:rPr>
@@ -6673,7 +8151,7 @@
             </w:r>
             <w:r>
               <w:rPr>
-                <w:rFonts w:ascii="Times New Roman" w:hAnsi="Times New Roman" w:eastAsia="Times New Roman" w:cs="Times New Roman"/>
+                <w:rFonts w:ascii="Times New Roman" w:hAnsi="Times New Roman" w:cs="Times New Roman"/>
                 <w:sz w:val="20"/>
                 <w:szCs w:val="20"/>
               </w:rPr>
@@ -6716,7 +8194,7 @@
             </w:r>
             <w:r>
               <w:rPr>
-                <w:rFonts w:ascii="Times New Roman" w:hAnsi="Times New Roman" w:eastAsia="Times New Roman" w:cs="Times New Roman"/>
+                <w:rFonts w:ascii="Times New Roman" w:hAnsi="Times New Roman" w:cs="Times New Roman"/>
                 <w:sz w:val="20"/>
                 <w:szCs w:val="20"/>
               </w:rPr>
@@ -6759,7 +8237,7 @@
             </w:r>
             <w:r>
               <w:rPr>
-                <w:rFonts w:ascii="Times New Roman" w:hAnsi="Times New Roman" w:eastAsia="Times New Roman" w:cs="Times New Roman"/>
+                <w:rFonts w:ascii="Times New Roman" w:hAnsi="Times New Roman" w:cs="Times New Roman"/>
                 <w:sz w:val="20"/>
                 <w:szCs w:val="20"/>
               </w:rPr>
@@ -6802,7 +8280,7 @@
             </w:r>
             <w:r>
               <w:rPr>
-                <w:rFonts w:ascii="Times New Roman" w:hAnsi="Times New Roman" w:eastAsia="Times New Roman" w:cs="Times New Roman"/>
+                <w:rFonts w:ascii="Times New Roman" w:hAnsi="Times New Roman" w:cs="Times New Roman"/>
                 <w:sz w:val="20"/>
                 <w:szCs w:val="20"/>
               </w:rPr>
@@ -6845,7 +8323,7 @@
             </w:r>
             <w:r>
               <w:rPr>
-                <w:rFonts w:ascii="Times New Roman" w:hAnsi="Times New Roman" w:eastAsia="Times New Roman" w:cs="Times New Roman"/>
+                <w:rFonts w:ascii="Times New Roman" w:hAnsi="Times New Roman" w:cs="Times New Roman"/>
                 <w:sz w:val="20"/>
                 <w:szCs w:val="20"/>
               </w:rPr>
@@ -6891,7 +8369,7 @@
             </w:r>
             <w:r>
               <w:rPr>
-                <w:rFonts w:ascii="Times New Roman" w:hAnsi="Times New Roman" w:eastAsia="Times New Roman" w:cs="Times New Roman"/>
+                <w:rFonts w:ascii="Times New Roman" w:hAnsi="Times New Roman" w:cs="Times New Roman"/>
                 <w:sz w:val="20"/>
                 <w:szCs w:val="20"/>
               </w:rPr>
@@ -6934,7 +8412,7 @@
             </w:r>
             <w:r>
               <w:rPr>
-                <w:rFonts w:ascii="Times New Roman" w:hAnsi="Times New Roman" w:eastAsia="Times New Roman" w:cs="Times New Roman"/>
+                <w:rFonts w:ascii="Times New Roman" w:hAnsi="Times New Roman" w:cs="Times New Roman"/>
                 <w:sz w:val="20"/>
                 <w:szCs w:val="20"/>
               </w:rPr>
@@ -6977,7 +8455,7 @@
             </w:r>
             <w:r>
               <w:rPr>
-                <w:rFonts w:ascii="Times New Roman" w:hAnsi="Times New Roman" w:eastAsia="Times New Roman" w:cs="Times New Roman"/>
+                <w:rFonts w:ascii="Times New Roman" w:hAnsi="Times New Roman" w:cs="Times New Roman"/>
                 <w:sz w:val="20"/>
                 <w:szCs w:val="20"/>
               </w:rPr>
@@ -7027,6 +8505,13 @@
                 <w:szCs w:val="20"/>
               </w:rPr>
             </w:r>
+            <w:r>
+              <w:rPr>
+                <w:rFonts w:ascii="Times New Roman" w:hAnsi="Times New Roman" w:cs="Times New Roman"/>
+                <w:sz w:val="20"/>
+                <w:szCs w:val="20"/>
+              </w:rPr>
+            </w:r>
           </w:p>
         </w:tc>
         <w:tc>
@@ -7065,7 +8550,7 @@
             </w:r>
             <w:r>
               <w:rPr>
-                <w:rFonts w:ascii="Times New Roman" w:hAnsi="Times New Roman" w:eastAsia="Times New Roman" w:cs="Times New Roman"/>
+                <w:rFonts w:ascii="Times New Roman" w:hAnsi="Times New Roman" w:cs="Times New Roman"/>
                 <w:sz w:val="20"/>
                 <w:szCs w:val="20"/>
               </w:rPr>
@@ -7108,7 +8593,7 @@
             </w:r>
             <w:r>
               <w:rPr>
-                <w:rFonts w:ascii="Times New Roman" w:hAnsi="Times New Roman" w:eastAsia="Times New Roman" w:cs="Times New Roman"/>
+                <w:rFonts w:ascii="Times New Roman" w:hAnsi="Times New Roman" w:cs="Times New Roman"/>
                 <w:sz w:val="20"/>
                 <w:szCs w:val="20"/>
               </w:rPr>
@@ -7156,7 +8641,7 @@
             </w:r>
             <w:r>
               <w:rPr>
-                <w:rFonts w:ascii="Times New Roman" w:hAnsi="Times New Roman" w:eastAsia="Times New Roman" w:cs="Times New Roman"/>
+                <w:rFonts w:ascii="Times New Roman" w:hAnsi="Times New Roman" w:cs="Times New Roman"/>
                 <w:sz w:val="20"/>
                 <w:szCs w:val="20"/>
               </w:rPr>
@@ -7199,7 +8684,7 @@
             </w:r>
             <w:r>
               <w:rPr>
-                <w:rFonts w:ascii="Times New Roman" w:hAnsi="Times New Roman" w:eastAsia="Times New Roman" w:cs="Times New Roman"/>
+                <w:rFonts w:ascii="Times New Roman" w:hAnsi="Times New Roman" w:cs="Times New Roman"/>
                 <w:sz w:val="20"/>
                 <w:szCs w:val="20"/>
               </w:rPr>
@@ -7242,7 +8727,7 @@
             </w:r>
             <w:r>
               <w:rPr>
-                <w:rFonts w:ascii="Times New Roman" w:hAnsi="Times New Roman" w:eastAsia="Times New Roman" w:cs="Times New Roman"/>
+                <w:rFonts w:ascii="Times New Roman" w:hAnsi="Times New Roman" w:cs="Times New Roman"/>
                 <w:sz w:val="20"/>
                 <w:szCs w:val="20"/>
               </w:rPr>
@@ -7290,6 +8775,13 @@
                 <w:szCs w:val="20"/>
               </w:rPr>
             </w:r>
+            <w:r>
+              <w:rPr>
+                <w:rFonts w:ascii="Times New Roman" w:hAnsi="Times New Roman" w:cs="Times New Roman"/>
+                <w:sz w:val="20"/>
+                <w:szCs w:val="20"/>
+              </w:rPr>
+            </w:r>
           </w:p>
         </w:tc>
         <w:tc>
@@ -7328,7 +8820,7 @@
             </w:r>
             <w:r>
               <w:rPr>
-                <w:rFonts w:ascii="Times New Roman" w:hAnsi="Times New Roman" w:eastAsia="Times New Roman" w:cs="Times New Roman"/>
+                <w:rFonts w:ascii="Times New Roman" w:hAnsi="Times New Roman" w:cs="Times New Roman"/>
                 <w:sz w:val="20"/>
                 <w:szCs w:val="20"/>
               </w:rPr>
@@ -7371,7 +8863,7 @@
             </w:r>
             <w:r>
               <w:rPr>
-                <w:rFonts w:ascii="Times New Roman" w:hAnsi="Times New Roman" w:eastAsia="Times New Roman" w:cs="Times New Roman"/>
+                <w:rFonts w:ascii="Times New Roman" w:hAnsi="Times New Roman" w:cs="Times New Roman"/>
                 <w:sz w:val="20"/>
                 <w:szCs w:val="20"/>
               </w:rPr>
@@ -7417,7 +8909,7 @@
             </w:r>
             <w:r>
               <w:rPr>
-                <w:rFonts w:ascii="Times New Roman" w:hAnsi="Times New Roman" w:eastAsia="Times New Roman" w:cs="Times New Roman"/>
+                <w:rFonts w:ascii="Times New Roman" w:hAnsi="Times New Roman" w:cs="Times New Roman"/>
                 <w:sz w:val="20"/>
                 <w:szCs w:val="20"/>
               </w:rPr>
@@ -7460,7 +8952,7 @@
             </w:r>
             <w:r>
               <w:rPr>
-                <w:rFonts w:ascii="Times New Roman" w:hAnsi="Times New Roman" w:eastAsia="Times New Roman" w:cs="Times New Roman"/>
+                <w:rFonts w:ascii="Times New Roman" w:hAnsi="Times New Roman" w:cs="Times New Roman"/>
                 <w:sz w:val="20"/>
                 <w:szCs w:val="20"/>
               </w:rPr>
@@ -7503,7 +8995,7 @@
             </w:r>
             <w:r>
               <w:rPr>
-                <w:rFonts w:ascii="Times New Roman" w:hAnsi="Times New Roman" w:eastAsia="Times New Roman" w:cs="Times New Roman"/>
+                <w:rFonts w:ascii="Times New Roman" w:hAnsi="Times New Roman" w:cs="Times New Roman"/>
                 <w:sz w:val="20"/>
                 <w:szCs w:val="20"/>
               </w:rPr>
@@ -7546,7 +9038,7 @@
             </w:r>
             <w:r>
               <w:rPr>
-                <w:rFonts w:ascii="Times New Roman" w:hAnsi="Times New Roman" w:eastAsia="Times New Roman" w:cs="Times New Roman"/>
+                <w:rFonts w:ascii="Times New Roman" w:hAnsi="Times New Roman" w:cs="Times New Roman"/>
                 <w:sz w:val="20"/>
                 <w:szCs w:val="20"/>
               </w:rPr>
@@ -7589,7 +9081,7 @@
             </w:r>
             <w:r>
               <w:rPr>
-                <w:rFonts w:ascii="Times New Roman" w:hAnsi="Times New Roman" w:eastAsia="Times New Roman" w:cs="Times New Roman"/>
+                <w:rFonts w:ascii="Times New Roman" w:hAnsi="Times New Roman" w:cs="Times New Roman"/>
                 <w:sz w:val="20"/>
                 <w:szCs w:val="20"/>
               </w:rPr>
@@ -7632,7 +9124,7 @@
             </w:r>
             <w:r>
               <w:rPr>
-                <w:rFonts w:ascii="Times New Roman" w:hAnsi="Times New Roman" w:eastAsia="Times New Roman" w:cs="Times New Roman"/>
+                <w:rFonts w:ascii="Times New Roman" w:hAnsi="Times New Roman" w:cs="Times New Roman"/>
                 <w:sz w:val="20"/>
                 <w:szCs w:val="20"/>
               </w:rPr>
@@ -7641,54 +9133,6 @@
         </w:tc>
       </w:tr>
     </w:tbl>
-    <w:p>
-      <w:pPr>
-        <w:pBdr/>
-        <w:spacing/>
-        <w:ind/>
-        <w:rPr/>
-      </w:pPr>
-      <w:r/>
-      <w:r/>
-      <w:r/>
-    </w:p>
-    <w:p>
-      <w:pPr>
-        <w:pBdr/>
-        <w:spacing/>
-        <w:ind/>
-        <w:rPr/>
-      </w:pPr>
-      <w:r/>
-      <w:r/>
-      <w:r/>
-    </w:p>
-    <w:p>
-      <w:pPr>
-        <w:pBdr/>
-        <w:spacing/>
-        <w:ind/>
-        <w:rPr/>
-      </w:pPr>
-      <w:r/>
-      <w:r/>
-      <w:bookmarkStart w:id="0" w:name="_GoBack"/>
-      <w:r/>
-      <w:bookmarkEnd w:id="0"/>
-      <w:r/>
-      <w:r/>
-    </w:p>
-    <w:p>
-      <w:pPr>
-        <w:pBdr/>
-        <w:spacing/>
-        <w:ind/>
-        <w:rPr/>
-      </w:pPr>
-      <w:r/>
-      <w:r/>
-      <w:r/>
-    </w:p>
     <w:p>
       <w:pPr>
         <w:pBdr/>
@@ -8163,7 +9607,6 @@
               </w:rPr>
               <w:t xml:space="preserve">Identificador </w:t>
             </w:r>
-            <w:r/>
             <w:r>
               <w:rPr>
                 <w:rFonts w:ascii="Times New Roman" w:hAnsi="Times New Roman" w:eastAsia="Times New Roman" w:cs="Times New Roman"/>
@@ -8191,7 +9634,7 @@
             </w:r>
             <w:r>
               <w:rPr>
-                <w:rFonts w:ascii="Times New Roman" w:hAnsi="Times New Roman" w:eastAsia="Times New Roman" w:cs="Times New Roman"/>
+                <w:rFonts w:ascii="Times New Roman" w:hAnsi="Times New Roman" w:cs="Times New Roman"/>
                 <w:sz w:val="20"/>
                 <w:szCs w:val="20"/>
               </w:rPr>
@@ -8234,7 +9677,7 @@
             </w:r>
             <w:r>
               <w:rPr>
-                <w:rFonts w:ascii="Times New Roman" w:hAnsi="Times New Roman" w:eastAsia="Times New Roman" w:cs="Times New Roman"/>
+                <w:rFonts w:ascii="Times New Roman" w:hAnsi="Times New Roman" w:cs="Times New Roman"/>
                 <w:sz w:val="20"/>
                 <w:szCs w:val="20"/>
               </w:rPr>
@@ -8277,7 +9720,7 @@
             </w:r>
             <w:r>
               <w:rPr>
-                <w:rFonts w:ascii="Times New Roman" w:hAnsi="Times New Roman" w:eastAsia="Times New Roman" w:cs="Times New Roman"/>
+                <w:rFonts w:ascii="Times New Roman" w:hAnsi="Times New Roman" w:cs="Times New Roman"/>
                 <w:sz w:val="20"/>
                 <w:szCs w:val="20"/>
               </w:rPr>
@@ -8320,7 +9763,7 @@
             </w:r>
             <w:r>
               <w:rPr>
-                <w:rFonts w:ascii="Times New Roman" w:hAnsi="Times New Roman" w:eastAsia="Times New Roman" w:cs="Times New Roman"/>
+                <w:rFonts w:ascii="Times New Roman" w:hAnsi="Times New Roman" w:cs="Times New Roman"/>
                 <w:sz w:val="20"/>
                 <w:szCs w:val="20"/>
               </w:rPr>
@@ -8363,7 +9806,7 @@
             </w:r>
             <w:r>
               <w:rPr>
-                <w:rFonts w:ascii="Times New Roman" w:hAnsi="Times New Roman" w:eastAsia="Times New Roman" w:cs="Times New Roman"/>
+                <w:rFonts w:ascii="Times New Roman" w:hAnsi="Times New Roman" w:cs="Times New Roman"/>
                 <w:sz w:val="20"/>
                 <w:szCs w:val="20"/>
               </w:rPr>
@@ -8406,7 +9849,7 @@
             </w:r>
             <w:r>
               <w:rPr>
-                <w:rFonts w:ascii="Times New Roman" w:hAnsi="Times New Roman" w:eastAsia="Times New Roman" w:cs="Times New Roman"/>
+                <w:rFonts w:ascii="Times New Roman" w:hAnsi="Times New Roman" w:cs="Times New Roman"/>
                 <w:sz w:val="20"/>
                 <w:szCs w:val="20"/>
               </w:rPr>
@@ -8451,7 +9894,6 @@
               </w:rPr>
               <w:t xml:space="preserve">Identificador </w:t>
             </w:r>
-            <w:r/>
             <w:r>
               <w:rPr>
                 <w:rFonts w:ascii="Times New Roman" w:hAnsi="Times New Roman" w:eastAsia="Times New Roman" w:cs="Times New Roman"/>
@@ -8470,7 +9912,7 @@
             </w:r>
             <w:r>
               <w:rPr>
-                <w:rFonts w:ascii="Times New Roman" w:hAnsi="Times New Roman" w:eastAsia="Times New Roman" w:cs="Times New Roman"/>
+                <w:rFonts w:ascii="Times New Roman" w:hAnsi="Times New Roman" w:cs="Times New Roman"/>
                 <w:sz w:val="20"/>
                 <w:szCs w:val="20"/>
               </w:rPr>
@@ -8513,7 +9955,7 @@
             </w:r>
             <w:r>
               <w:rPr>
-                <w:rFonts w:ascii="Times New Roman" w:hAnsi="Times New Roman" w:eastAsia="Times New Roman" w:cs="Times New Roman"/>
+                <w:rFonts w:ascii="Times New Roman" w:hAnsi="Times New Roman" w:cs="Times New Roman"/>
                 <w:sz w:val="20"/>
                 <w:szCs w:val="20"/>
               </w:rPr>
@@ -8556,7 +9998,7 @@
             </w:r>
             <w:r>
               <w:rPr>
-                <w:rFonts w:ascii="Times New Roman" w:hAnsi="Times New Roman" w:eastAsia="Times New Roman" w:cs="Times New Roman"/>
+                <w:rFonts w:ascii="Times New Roman" w:hAnsi="Times New Roman" w:cs="Times New Roman"/>
                 <w:sz w:val="20"/>
                 <w:szCs w:val="20"/>
               </w:rPr>
@@ -8599,7 +10041,7 @@
             </w:r>
             <w:r>
               <w:rPr>
-                <w:rFonts w:ascii="Times New Roman" w:hAnsi="Times New Roman" w:eastAsia="Times New Roman" w:cs="Times New Roman"/>
+                <w:rFonts w:ascii="Times New Roman" w:hAnsi="Times New Roman" w:cs="Times New Roman"/>
                 <w:sz w:val="20"/>
                 <w:szCs w:val="20"/>
               </w:rPr>
@@ -8642,7 +10084,7 @@
             </w:r>
             <w:r>
               <w:rPr>
-                <w:rFonts w:ascii="Times New Roman" w:hAnsi="Times New Roman" w:eastAsia="Times New Roman" w:cs="Times New Roman"/>
+                <w:rFonts w:ascii="Times New Roman" w:hAnsi="Times New Roman" w:cs="Times New Roman"/>
                 <w:sz w:val="20"/>
                 <w:szCs w:val="20"/>
               </w:rPr>
@@ -8685,7 +10127,7 @@
             </w:r>
             <w:r>
               <w:rPr>
-                <w:rFonts w:ascii="Times New Roman" w:hAnsi="Times New Roman" w:eastAsia="Times New Roman" w:cs="Times New Roman"/>
+                <w:rFonts w:ascii="Times New Roman" w:hAnsi="Times New Roman" w:cs="Times New Roman"/>
                 <w:sz w:val="20"/>
                 <w:szCs w:val="20"/>
               </w:rPr>
@@ -8740,7 +10182,7 @@
             </w:r>
             <w:r>
               <w:rPr>
-                <w:rFonts w:ascii="Times New Roman" w:hAnsi="Times New Roman" w:eastAsia="Times New Roman" w:cs="Times New Roman"/>
+                <w:rFonts w:ascii="Times New Roman" w:hAnsi="Times New Roman" w:cs="Times New Roman"/>
                 <w:sz w:val="20"/>
                 <w:szCs w:val="20"/>
               </w:rPr>
@@ -8783,7 +10225,7 @@
             </w:r>
             <w:r>
               <w:rPr>
-                <w:rFonts w:ascii="Times New Roman" w:hAnsi="Times New Roman" w:eastAsia="Times New Roman" w:cs="Times New Roman"/>
+                <w:rFonts w:ascii="Times New Roman" w:hAnsi="Times New Roman" w:cs="Times New Roman"/>
                 <w:sz w:val="20"/>
                 <w:szCs w:val="20"/>
               </w:rPr>
@@ -8826,7 +10268,7 @@
             </w:r>
             <w:r>
               <w:rPr>
-                <w:rFonts w:ascii="Times New Roman" w:hAnsi="Times New Roman" w:eastAsia="Times New Roman" w:cs="Times New Roman"/>
+                <w:rFonts w:ascii="Times New Roman" w:hAnsi="Times New Roman" w:cs="Times New Roman"/>
                 <w:sz w:val="20"/>
                 <w:szCs w:val="20"/>
               </w:rPr>
@@ -8869,7 +10311,7 @@
             </w:r>
             <w:r>
               <w:rPr>
-                <w:rFonts w:ascii="Times New Roman" w:hAnsi="Times New Roman" w:eastAsia="Times New Roman" w:cs="Times New Roman"/>
+                <w:rFonts w:ascii="Times New Roman" w:hAnsi="Times New Roman" w:cs="Times New Roman"/>
                 <w:sz w:val="20"/>
                 <w:szCs w:val="20"/>
               </w:rPr>
@@ -8912,7 +10354,7 @@
             </w:r>
             <w:r>
               <w:rPr>
-                <w:rFonts w:ascii="Times New Roman" w:hAnsi="Times New Roman" w:eastAsia="Times New Roman" w:cs="Times New Roman"/>
+                <w:rFonts w:ascii="Times New Roman" w:hAnsi="Times New Roman" w:cs="Times New Roman"/>
                 <w:sz w:val="20"/>
                 <w:szCs w:val="20"/>
               </w:rPr>
@@ -8955,7 +10397,7 @@
             </w:r>
             <w:r>
               <w:rPr>
-                <w:rFonts w:ascii="Times New Roman" w:hAnsi="Times New Roman" w:eastAsia="Times New Roman" w:cs="Times New Roman"/>
+                <w:rFonts w:ascii="Times New Roman" w:hAnsi="Times New Roman" w:cs="Times New Roman"/>
                 <w:sz w:val="20"/>
                 <w:szCs w:val="20"/>
               </w:rPr>
@@ -9012,7 +10454,7 @@
             </w:r>
             <w:r>
               <w:rPr>
-                <w:rFonts w:ascii="Times New Roman" w:hAnsi="Times New Roman" w:eastAsia="Times New Roman" w:cs="Times New Roman"/>
+                <w:rFonts w:ascii="Times New Roman" w:hAnsi="Times New Roman" w:cs="Times New Roman"/>
                 <w:sz w:val="20"/>
                 <w:szCs w:val="20"/>
               </w:rPr>
@@ -9055,7 +10497,7 @@
             </w:r>
             <w:r>
               <w:rPr>
-                <w:rFonts w:ascii="Times New Roman" w:hAnsi="Times New Roman" w:eastAsia="Times New Roman" w:cs="Times New Roman"/>
+                <w:rFonts w:ascii="Times New Roman" w:hAnsi="Times New Roman" w:cs="Times New Roman"/>
                 <w:sz w:val="20"/>
                 <w:szCs w:val="20"/>
               </w:rPr>
@@ -9098,7 +10540,7 @@
             </w:r>
             <w:r>
               <w:rPr>
-                <w:rFonts w:ascii="Times New Roman" w:hAnsi="Times New Roman" w:eastAsia="Times New Roman" w:cs="Times New Roman"/>
+                <w:rFonts w:ascii="Times New Roman" w:hAnsi="Times New Roman" w:cs="Times New Roman"/>
                 <w:sz w:val="20"/>
                 <w:szCs w:val="20"/>
               </w:rPr>
@@ -9141,7 +10583,7 @@
             </w:r>
             <w:r>
               <w:rPr>
-                <w:rFonts w:ascii="Times New Roman" w:hAnsi="Times New Roman" w:eastAsia="Times New Roman" w:cs="Times New Roman"/>
+                <w:rFonts w:ascii="Times New Roman" w:hAnsi="Times New Roman" w:cs="Times New Roman"/>
                 <w:sz w:val="20"/>
                 <w:szCs w:val="20"/>
               </w:rPr>
@@ -9184,7 +10626,7 @@
             </w:r>
             <w:r>
               <w:rPr>
-                <w:rFonts w:ascii="Times New Roman" w:hAnsi="Times New Roman" w:eastAsia="Times New Roman" w:cs="Times New Roman"/>
+                <w:rFonts w:ascii="Times New Roman" w:hAnsi="Times New Roman" w:cs="Times New Roman"/>
                 <w:sz w:val="20"/>
                 <w:szCs w:val="20"/>
               </w:rPr>
@@ -9227,7 +10669,7 @@
             </w:r>
             <w:r>
               <w:rPr>
-                <w:rFonts w:ascii="Times New Roman" w:hAnsi="Times New Roman" w:eastAsia="Times New Roman" w:cs="Times New Roman"/>
+                <w:rFonts w:ascii="Times New Roman" w:hAnsi="Times New Roman" w:cs="Times New Roman"/>
                 <w:sz w:val="20"/>
                 <w:szCs w:val="20"/>
               </w:rPr>
@@ -9282,7 +10724,7 @@
             </w:r>
             <w:r>
               <w:rPr>
-                <w:rFonts w:ascii="Times New Roman" w:hAnsi="Times New Roman" w:eastAsia="Times New Roman" w:cs="Times New Roman"/>
+                <w:rFonts w:ascii="Times New Roman" w:hAnsi="Times New Roman" w:cs="Times New Roman"/>
                 <w:sz w:val="20"/>
                 <w:szCs w:val="20"/>
               </w:rPr>
@@ -9325,7 +10767,7 @@
             </w:r>
             <w:r>
               <w:rPr>
-                <w:rFonts w:ascii="Times New Roman" w:hAnsi="Times New Roman" w:eastAsia="Times New Roman" w:cs="Times New Roman"/>
+                <w:rFonts w:ascii="Times New Roman" w:hAnsi="Times New Roman" w:cs="Times New Roman"/>
                 <w:sz w:val="20"/>
                 <w:szCs w:val="20"/>
               </w:rPr>
@@ -9368,7 +10810,7 @@
             </w:r>
             <w:r>
               <w:rPr>
-                <w:rFonts w:ascii="Times New Roman" w:hAnsi="Times New Roman" w:eastAsia="Times New Roman" w:cs="Times New Roman"/>
+                <w:rFonts w:ascii="Times New Roman" w:hAnsi="Times New Roman" w:cs="Times New Roman"/>
                 <w:sz w:val="20"/>
                 <w:szCs w:val="20"/>
               </w:rPr>
@@ -9411,7 +10853,7 @@
             </w:r>
             <w:r>
               <w:rPr>
-                <w:rFonts w:ascii="Times New Roman" w:hAnsi="Times New Roman" w:eastAsia="Times New Roman" w:cs="Times New Roman"/>
+                <w:rFonts w:ascii="Times New Roman" w:hAnsi="Times New Roman" w:cs="Times New Roman"/>
                 <w:sz w:val="20"/>
                 <w:szCs w:val="20"/>
               </w:rPr>
@@ -9454,7 +10896,7 @@
             </w:r>
             <w:r>
               <w:rPr>
-                <w:rFonts w:ascii="Times New Roman" w:hAnsi="Times New Roman" w:eastAsia="Times New Roman" w:cs="Times New Roman"/>
+                <w:rFonts w:ascii="Times New Roman" w:hAnsi="Times New Roman" w:cs="Times New Roman"/>
                 <w:sz w:val="20"/>
                 <w:szCs w:val="20"/>
               </w:rPr>
@@ -9497,7 +10939,7 @@
             </w:r>
             <w:r>
               <w:rPr>
-                <w:rFonts w:ascii="Times New Roman" w:hAnsi="Times New Roman" w:eastAsia="Times New Roman" w:cs="Times New Roman"/>
+                <w:rFonts w:ascii="Times New Roman" w:hAnsi="Times New Roman" w:cs="Times New Roman"/>
                 <w:sz w:val="20"/>
                 <w:szCs w:val="20"/>
               </w:rPr>
@@ -9513,7 +10955,6 @@
         <w:ind/>
         <w:rPr/>
       </w:pPr>
-      <w:r/>
       <w:r/>
       <w:r/>
     </w:p>
@@ -9962,7 +11403,7 @@
             </w:r>
             <w:r>
               <w:rPr>
-                <w:rFonts w:ascii="Times New Roman" w:hAnsi="Times New Roman" w:eastAsia="Times New Roman" w:cs="Times New Roman"/>
+                <w:rFonts w:ascii="Times New Roman" w:hAnsi="Times New Roman" w:cs="Times New Roman"/>
                 <w:sz w:val="20"/>
                 <w:szCs w:val="20"/>
               </w:rPr>
@@ -10005,7 +11446,7 @@
             </w:r>
             <w:r>
               <w:rPr>
-                <w:rFonts w:ascii="Times New Roman" w:hAnsi="Times New Roman" w:eastAsia="Times New Roman" w:cs="Times New Roman"/>
+                <w:rFonts w:ascii="Times New Roman" w:hAnsi="Times New Roman" w:cs="Times New Roman"/>
                 <w:sz w:val="20"/>
                 <w:szCs w:val="20"/>
               </w:rPr>
@@ -10048,7 +11489,7 @@
             </w:r>
             <w:r>
               <w:rPr>
-                <w:rFonts w:ascii="Times New Roman" w:hAnsi="Times New Roman" w:eastAsia="Times New Roman" w:cs="Times New Roman"/>
+                <w:rFonts w:ascii="Times New Roman" w:hAnsi="Times New Roman" w:cs="Times New Roman"/>
                 <w:sz w:val="20"/>
                 <w:szCs w:val="20"/>
               </w:rPr>
@@ -10091,7 +11532,7 @@
             </w:r>
             <w:r>
               <w:rPr>
-                <w:rFonts w:ascii="Times New Roman" w:hAnsi="Times New Roman" w:eastAsia="Times New Roman" w:cs="Times New Roman"/>
+                <w:rFonts w:ascii="Times New Roman" w:hAnsi="Times New Roman" w:cs="Times New Roman"/>
                 <w:sz w:val="20"/>
                 <w:szCs w:val="20"/>
               </w:rPr>
@@ -10134,7 +11575,7 @@
             </w:r>
             <w:r>
               <w:rPr>
-                <w:rFonts w:ascii="Times New Roman" w:hAnsi="Times New Roman" w:eastAsia="Times New Roman" w:cs="Times New Roman"/>
+                <w:rFonts w:ascii="Times New Roman" w:hAnsi="Times New Roman" w:cs="Times New Roman"/>
                 <w:sz w:val="20"/>
                 <w:szCs w:val="20"/>
               </w:rPr>
@@ -10177,7 +11618,7 @@
             </w:r>
             <w:r>
               <w:rPr>
-                <w:rFonts w:ascii="Times New Roman" w:hAnsi="Times New Roman" w:eastAsia="Times New Roman" w:cs="Times New Roman"/>
+                <w:rFonts w:ascii="Times New Roman" w:hAnsi="Times New Roman" w:cs="Times New Roman"/>
                 <w:sz w:val="20"/>
                 <w:szCs w:val="20"/>
               </w:rPr>
@@ -10223,7 +11664,7 @@
             </w:r>
             <w:r>
               <w:rPr>
-                <w:rFonts w:ascii="Times New Roman" w:hAnsi="Times New Roman" w:eastAsia="Times New Roman" w:cs="Times New Roman"/>
+                <w:rFonts w:ascii="Times New Roman" w:hAnsi="Times New Roman" w:cs="Times New Roman"/>
                 <w:sz w:val="20"/>
                 <w:szCs w:val="20"/>
               </w:rPr>
@@ -10266,7 +11707,7 @@
             </w:r>
             <w:r>
               <w:rPr>
-                <w:rFonts w:ascii="Times New Roman" w:hAnsi="Times New Roman" w:eastAsia="Times New Roman" w:cs="Times New Roman"/>
+                <w:rFonts w:ascii="Times New Roman" w:hAnsi="Times New Roman" w:cs="Times New Roman"/>
                 <w:sz w:val="20"/>
                 <w:szCs w:val="20"/>
               </w:rPr>
@@ -10309,7 +11750,7 @@
             </w:r>
             <w:r>
               <w:rPr>
-                <w:rFonts w:ascii="Times New Roman" w:hAnsi="Times New Roman" w:eastAsia="Times New Roman" w:cs="Times New Roman"/>
+                <w:rFonts w:ascii="Times New Roman" w:hAnsi="Times New Roman" w:cs="Times New Roman"/>
                 <w:sz w:val="20"/>
                 <w:szCs w:val="20"/>
               </w:rPr>
@@ -10352,7 +11793,7 @@
             </w:r>
             <w:r>
               <w:rPr>
-                <w:rFonts w:ascii="Times New Roman" w:hAnsi="Times New Roman" w:eastAsia="Times New Roman" w:cs="Times New Roman"/>
+                <w:rFonts w:ascii="Times New Roman" w:hAnsi="Times New Roman" w:cs="Times New Roman"/>
                 <w:sz w:val="20"/>
                 <w:szCs w:val="20"/>
               </w:rPr>
@@ -10395,7 +11836,7 @@
             </w:r>
             <w:r>
               <w:rPr>
-                <w:rFonts w:ascii="Times New Roman" w:hAnsi="Times New Roman" w:eastAsia="Times New Roman" w:cs="Times New Roman"/>
+                <w:rFonts w:ascii="Times New Roman" w:hAnsi="Times New Roman" w:cs="Times New Roman"/>
                 <w:sz w:val="20"/>
                 <w:szCs w:val="20"/>
               </w:rPr>
@@ -10438,7 +11879,7 @@
             </w:r>
             <w:r>
               <w:rPr>
-                <w:rFonts w:ascii="Times New Roman" w:hAnsi="Times New Roman" w:eastAsia="Times New Roman" w:cs="Times New Roman"/>
+                <w:rFonts w:ascii="Times New Roman" w:hAnsi="Times New Roman" w:cs="Times New Roman"/>
                 <w:sz w:val="20"/>
                 <w:szCs w:val="20"/>
               </w:rPr>
@@ -10484,7 +11925,7 @@
             </w:r>
             <w:r>
               <w:rPr>
-                <w:rFonts w:ascii="Times New Roman" w:hAnsi="Times New Roman" w:eastAsia="Times New Roman" w:cs="Times New Roman"/>
+                <w:rFonts w:ascii="Times New Roman" w:hAnsi="Times New Roman" w:cs="Times New Roman"/>
                 <w:sz w:val="20"/>
                 <w:szCs w:val="20"/>
               </w:rPr>
@@ -10527,7 +11968,7 @@
             </w:r>
             <w:r>
               <w:rPr>
-                <w:rFonts w:ascii="Times New Roman" w:hAnsi="Times New Roman" w:eastAsia="Times New Roman" w:cs="Times New Roman"/>
+                <w:rFonts w:ascii="Times New Roman" w:hAnsi="Times New Roman" w:cs="Times New Roman"/>
                 <w:sz w:val="20"/>
                 <w:szCs w:val="20"/>
               </w:rPr>
@@ -10570,7 +12011,7 @@
             </w:r>
             <w:r>
               <w:rPr>
-                <w:rFonts w:ascii="Times New Roman" w:hAnsi="Times New Roman" w:eastAsia="Times New Roman" w:cs="Times New Roman"/>
+                <w:rFonts w:ascii="Times New Roman" w:hAnsi="Times New Roman" w:cs="Times New Roman"/>
                 <w:sz w:val="20"/>
                 <w:szCs w:val="20"/>
               </w:rPr>
@@ -10613,7 +12054,7 @@
             </w:r>
             <w:r>
               <w:rPr>
-                <w:rFonts w:ascii="Times New Roman" w:hAnsi="Times New Roman" w:eastAsia="Times New Roman" w:cs="Times New Roman"/>
+                <w:rFonts w:ascii="Times New Roman" w:hAnsi="Times New Roman" w:cs="Times New Roman"/>
                 <w:sz w:val="20"/>
                 <w:szCs w:val="20"/>
               </w:rPr>
@@ -10656,7 +12097,7 @@
             </w:r>
             <w:r>
               <w:rPr>
-                <w:rFonts w:ascii="Times New Roman" w:hAnsi="Times New Roman" w:eastAsia="Times New Roman" w:cs="Times New Roman"/>
+                <w:rFonts w:ascii="Times New Roman" w:hAnsi="Times New Roman" w:cs="Times New Roman"/>
                 <w:sz w:val="20"/>
                 <w:szCs w:val="20"/>
               </w:rPr>
@@ -10699,7 +12140,7 @@
             </w:r>
             <w:r>
               <w:rPr>
-                <w:rFonts w:ascii="Times New Roman" w:hAnsi="Times New Roman" w:eastAsia="Times New Roman" w:cs="Times New Roman"/>
+                <w:rFonts w:ascii="Times New Roman" w:hAnsi="Times New Roman" w:cs="Times New Roman"/>
                 <w:sz w:val="20"/>
                 <w:szCs w:val="20"/>
               </w:rPr>
@@ -10747,7 +12188,7 @@
             </w:r>
             <w:r>
               <w:rPr>
-                <w:rFonts w:ascii="Times New Roman" w:hAnsi="Times New Roman" w:eastAsia="Times New Roman" w:cs="Times New Roman"/>
+                <w:rFonts w:ascii="Times New Roman" w:hAnsi="Times New Roman" w:cs="Times New Roman"/>
                 <w:sz w:val="20"/>
                 <w:szCs w:val="20"/>
               </w:rPr>
@@ -10790,7 +12231,7 @@
             </w:r>
             <w:r>
               <w:rPr>
-                <w:rFonts w:ascii="Times New Roman" w:hAnsi="Times New Roman" w:eastAsia="Times New Roman" w:cs="Times New Roman"/>
+                <w:rFonts w:ascii="Times New Roman" w:hAnsi="Times New Roman" w:cs="Times New Roman"/>
                 <w:sz w:val="20"/>
                 <w:szCs w:val="20"/>
               </w:rPr>
@@ -10833,7 +12274,7 @@
             </w:r>
             <w:r>
               <w:rPr>
-                <w:rFonts w:ascii="Times New Roman" w:hAnsi="Times New Roman" w:eastAsia="Times New Roman" w:cs="Times New Roman"/>
+                <w:rFonts w:ascii="Times New Roman" w:hAnsi="Times New Roman" w:cs="Times New Roman"/>
                 <w:sz w:val="20"/>
                 <w:szCs w:val="20"/>
               </w:rPr>
@@ -10876,7 +12317,7 @@
             </w:r>
             <w:r>
               <w:rPr>
-                <w:rFonts w:ascii="Times New Roman" w:hAnsi="Times New Roman" w:eastAsia="Times New Roman" w:cs="Times New Roman"/>
+                <w:rFonts w:ascii="Times New Roman" w:hAnsi="Times New Roman" w:cs="Times New Roman"/>
                 <w:sz w:val="20"/>
                 <w:szCs w:val="20"/>
               </w:rPr>
@@ -10919,7 +12360,7 @@
             </w:r>
             <w:r>
               <w:rPr>
-                <w:rFonts w:ascii="Times New Roman" w:hAnsi="Times New Roman" w:eastAsia="Times New Roman" w:cs="Times New Roman"/>
+                <w:rFonts w:ascii="Times New Roman" w:hAnsi="Times New Roman" w:cs="Times New Roman"/>
                 <w:sz w:val="20"/>
                 <w:szCs w:val="20"/>
               </w:rPr>
@@ -10962,7 +12403,7 @@
             </w:r>
             <w:r>
               <w:rPr>
-                <w:rFonts w:ascii="Times New Roman" w:hAnsi="Times New Roman" w:eastAsia="Times New Roman" w:cs="Times New Roman"/>
+                <w:rFonts w:ascii="Times New Roman" w:hAnsi="Times New Roman" w:cs="Times New Roman"/>
                 <w:sz w:val="20"/>
                 <w:szCs w:val="20"/>
               </w:rPr>
@@ -11008,7 +12449,7 @@
             </w:r>
             <w:r>
               <w:rPr>
-                <w:rFonts w:ascii="Times New Roman" w:hAnsi="Times New Roman" w:eastAsia="Times New Roman" w:cs="Times New Roman"/>
+                <w:rFonts w:ascii="Times New Roman" w:hAnsi="Times New Roman" w:cs="Times New Roman"/>
                 <w:sz w:val="20"/>
                 <w:szCs w:val="20"/>
               </w:rPr>
@@ -11051,7 +12492,7 @@
             </w:r>
             <w:r>
               <w:rPr>
-                <w:rFonts w:ascii="Times New Roman" w:hAnsi="Times New Roman" w:eastAsia="Times New Roman" w:cs="Times New Roman"/>
+                <w:rFonts w:ascii="Times New Roman" w:hAnsi="Times New Roman" w:cs="Times New Roman"/>
                 <w:sz w:val="20"/>
                 <w:szCs w:val="20"/>
               </w:rPr>
@@ -11094,7 +12535,7 @@
             </w:r>
             <w:r>
               <w:rPr>
-                <w:rFonts w:ascii="Times New Roman" w:hAnsi="Times New Roman" w:eastAsia="Times New Roman" w:cs="Times New Roman"/>
+                <w:rFonts w:ascii="Times New Roman" w:hAnsi="Times New Roman" w:cs="Times New Roman"/>
                 <w:sz w:val="20"/>
                 <w:szCs w:val="20"/>
               </w:rPr>
@@ -11137,7 +12578,7 @@
             </w:r>
             <w:r>
               <w:rPr>
-                <w:rFonts w:ascii="Times New Roman" w:hAnsi="Times New Roman" w:eastAsia="Times New Roman" w:cs="Times New Roman"/>
+                <w:rFonts w:ascii="Times New Roman" w:hAnsi="Times New Roman" w:cs="Times New Roman"/>
                 <w:sz w:val="20"/>
                 <w:szCs w:val="20"/>
               </w:rPr>
@@ -11180,7 +12621,7 @@
             </w:r>
             <w:r>
               <w:rPr>
-                <w:rFonts w:ascii="Times New Roman" w:hAnsi="Times New Roman" w:eastAsia="Times New Roman" w:cs="Times New Roman"/>
+                <w:rFonts w:ascii="Times New Roman" w:hAnsi="Times New Roman" w:cs="Times New Roman"/>
                 <w:sz w:val="20"/>
                 <w:szCs w:val="20"/>
               </w:rPr>
@@ -11223,7 +12664,7 @@
             </w:r>
             <w:r>
               <w:rPr>
-                <w:rFonts w:ascii="Times New Roman" w:hAnsi="Times New Roman" w:eastAsia="Times New Roman" w:cs="Times New Roman"/>
+                <w:rFonts w:ascii="Times New Roman" w:hAnsi="Times New Roman" w:cs="Times New Roman"/>
                 <w:sz w:val="20"/>
                 <w:szCs w:val="20"/>
               </w:rPr>
@@ -11269,7 +12710,7 @@
             </w:r>
             <w:r>
               <w:rPr>
-                <w:rFonts w:ascii="Times New Roman" w:hAnsi="Times New Roman" w:eastAsia="Times New Roman" w:cs="Times New Roman"/>
+                <w:rFonts w:ascii="Times New Roman" w:hAnsi="Times New Roman" w:cs="Times New Roman"/>
                 <w:sz w:val="20"/>
                 <w:szCs w:val="20"/>
               </w:rPr>
@@ -11312,7 +12753,7 @@
             </w:r>
             <w:r>
               <w:rPr>
-                <w:rFonts w:ascii="Times New Roman" w:hAnsi="Times New Roman" w:eastAsia="Times New Roman" w:cs="Times New Roman"/>
+                <w:rFonts w:ascii="Times New Roman" w:hAnsi="Times New Roman" w:cs="Times New Roman"/>
                 <w:sz w:val="20"/>
                 <w:szCs w:val="20"/>
               </w:rPr>
@@ -11355,7 +12796,7 @@
             </w:r>
             <w:r>
               <w:rPr>
-                <w:rFonts w:ascii="Times New Roman" w:hAnsi="Times New Roman" w:eastAsia="Times New Roman" w:cs="Times New Roman"/>
+                <w:rFonts w:ascii="Times New Roman" w:hAnsi="Times New Roman" w:cs="Times New Roman"/>
                 <w:sz w:val="20"/>
                 <w:szCs w:val="20"/>
               </w:rPr>
@@ -11398,7 +12839,7 @@
             </w:r>
             <w:r>
               <w:rPr>
-                <w:rFonts w:ascii="Times New Roman" w:hAnsi="Times New Roman" w:eastAsia="Times New Roman" w:cs="Times New Roman"/>
+                <w:rFonts w:ascii="Times New Roman" w:hAnsi="Times New Roman" w:cs="Times New Roman"/>
                 <w:sz w:val="20"/>
                 <w:szCs w:val="20"/>
               </w:rPr>
@@ -11441,7 +12882,7 @@
             </w:r>
             <w:r>
               <w:rPr>
-                <w:rFonts w:ascii="Times New Roman" w:hAnsi="Times New Roman" w:eastAsia="Times New Roman" w:cs="Times New Roman"/>
+                <w:rFonts w:ascii="Times New Roman" w:hAnsi="Times New Roman" w:cs="Times New Roman"/>
                 <w:sz w:val="20"/>
                 <w:szCs w:val="20"/>
               </w:rPr>
@@ -11484,7 +12925,7 @@
             </w:r>
             <w:r>
               <w:rPr>
-                <w:rFonts w:ascii="Times New Roman" w:hAnsi="Times New Roman" w:eastAsia="Times New Roman" w:cs="Times New Roman"/>
+                <w:rFonts w:ascii="Times New Roman" w:hAnsi="Times New Roman" w:cs="Times New Roman"/>
                 <w:sz w:val="20"/>
                 <w:szCs w:val="20"/>
               </w:rPr>
@@ -11500,7 +12941,6 @@
         <w:ind/>
         <w:rPr/>
       </w:pPr>
-      <w:r/>
       <w:r/>
       <w:r/>
     </w:p>
@@ -11540,7 +12980,7 @@
       </w:r>
       <w:r>
         <w:rPr>
-          <w:rFonts w:ascii="Times New Roman" w:hAnsi="Times New Roman" w:eastAsia="Times New Roman" w:cs="Times New Roman"/>
+          <w:rFonts w:ascii="Times New Roman" w:hAnsi="Times New Roman" w:cs="Times New Roman"/>
           <w:b/>
           <w:bCs/>
           <w:sz w:val="28"/>
@@ -11938,7 +13378,6 @@
               </w:rPr>
               <w:t xml:space="preserve">Identificador </w:t>
             </w:r>
-            <w:r/>
             <w:r>
               <w:rPr>
                 <w:rFonts w:ascii="Times New Roman" w:hAnsi="Times New Roman" w:eastAsia="Times New Roman" w:cs="Times New Roman"/>
@@ -11957,7 +13396,7 @@
             </w:r>
             <w:r>
               <w:rPr>
-                <w:rFonts w:ascii="Times New Roman" w:hAnsi="Times New Roman" w:eastAsia="Times New Roman" w:cs="Times New Roman"/>
+                <w:rFonts w:ascii="Times New Roman" w:hAnsi="Times New Roman" w:cs="Times New Roman"/>
                 <w:sz w:val="20"/>
                 <w:szCs w:val="20"/>
               </w:rPr>
@@ -12000,7 +13439,7 @@
             </w:r>
             <w:r>
               <w:rPr>
-                <w:rFonts w:ascii="Times New Roman" w:hAnsi="Times New Roman" w:eastAsia="Times New Roman" w:cs="Times New Roman"/>
+                <w:rFonts w:ascii="Times New Roman" w:hAnsi="Times New Roman" w:cs="Times New Roman"/>
                 <w:sz w:val="20"/>
                 <w:szCs w:val="20"/>
               </w:rPr>
@@ -12043,7 +13482,7 @@
             </w:r>
             <w:r>
               <w:rPr>
-                <w:rFonts w:ascii="Times New Roman" w:hAnsi="Times New Roman" w:eastAsia="Times New Roman" w:cs="Times New Roman"/>
+                <w:rFonts w:ascii="Times New Roman" w:hAnsi="Times New Roman" w:cs="Times New Roman"/>
                 <w:sz w:val="20"/>
                 <w:szCs w:val="20"/>
               </w:rPr>
@@ -12086,7 +13525,7 @@
             </w:r>
             <w:r>
               <w:rPr>
-                <w:rFonts w:ascii="Times New Roman" w:hAnsi="Times New Roman" w:eastAsia="Times New Roman" w:cs="Times New Roman"/>
+                <w:rFonts w:ascii="Times New Roman" w:hAnsi="Times New Roman" w:cs="Times New Roman"/>
                 <w:sz w:val="20"/>
                 <w:szCs w:val="20"/>
               </w:rPr>
@@ -12129,7 +13568,7 @@
             </w:r>
             <w:r>
               <w:rPr>
-                <w:rFonts w:ascii="Times New Roman" w:hAnsi="Times New Roman" w:eastAsia="Times New Roman" w:cs="Times New Roman"/>
+                <w:rFonts w:ascii="Times New Roman" w:hAnsi="Times New Roman" w:cs="Times New Roman"/>
                 <w:sz w:val="20"/>
                 <w:szCs w:val="20"/>
               </w:rPr>
@@ -12172,7 +13611,7 @@
             </w:r>
             <w:r>
               <w:rPr>
-                <w:rFonts w:ascii="Times New Roman" w:hAnsi="Times New Roman" w:eastAsia="Times New Roman" w:cs="Times New Roman"/>
+                <w:rFonts w:ascii="Times New Roman" w:hAnsi="Times New Roman" w:cs="Times New Roman"/>
                 <w:sz w:val="20"/>
                 <w:szCs w:val="20"/>
               </w:rPr>
@@ -12217,7 +13656,6 @@
               </w:rPr>
               <w:t xml:space="preserve">Identificador </w:t>
             </w:r>
-            <w:r/>
             <w:r>
               <w:rPr>
                 <w:rFonts w:ascii="Times New Roman" w:hAnsi="Times New Roman" w:eastAsia="Times New Roman" w:cs="Times New Roman"/>
@@ -12236,7 +13674,7 @@
             </w:r>
             <w:r>
               <w:rPr>
-                <w:rFonts w:ascii="Times New Roman" w:hAnsi="Times New Roman" w:eastAsia="Times New Roman" w:cs="Times New Roman"/>
+                <w:rFonts w:ascii="Times New Roman" w:hAnsi="Times New Roman" w:cs="Times New Roman"/>
                 <w:sz w:val="20"/>
                 <w:szCs w:val="20"/>
               </w:rPr>
@@ -12279,7 +13717,7 @@
             </w:r>
             <w:r>
               <w:rPr>
-                <w:rFonts w:ascii="Times New Roman" w:hAnsi="Times New Roman" w:eastAsia="Times New Roman" w:cs="Times New Roman"/>
+                <w:rFonts w:ascii="Times New Roman" w:hAnsi="Times New Roman" w:cs="Times New Roman"/>
                 <w:sz w:val="20"/>
                 <w:szCs w:val="20"/>
               </w:rPr>
@@ -12322,7 +13760,7 @@
             </w:r>
             <w:r>
               <w:rPr>
-                <w:rFonts w:ascii="Times New Roman" w:hAnsi="Times New Roman" w:eastAsia="Times New Roman" w:cs="Times New Roman"/>
+                <w:rFonts w:ascii="Times New Roman" w:hAnsi="Times New Roman" w:cs="Times New Roman"/>
                 <w:sz w:val="20"/>
                 <w:szCs w:val="20"/>
               </w:rPr>
@@ -12365,7 +13803,7 @@
             </w:r>
             <w:r>
               <w:rPr>
-                <w:rFonts w:ascii="Times New Roman" w:hAnsi="Times New Roman" w:eastAsia="Times New Roman" w:cs="Times New Roman"/>
+                <w:rFonts w:ascii="Times New Roman" w:hAnsi="Times New Roman" w:cs="Times New Roman"/>
                 <w:sz w:val="20"/>
                 <w:szCs w:val="20"/>
               </w:rPr>
@@ -12408,7 +13846,7 @@
             </w:r>
             <w:r>
               <w:rPr>
-                <w:rFonts w:ascii="Times New Roman" w:hAnsi="Times New Roman" w:eastAsia="Times New Roman" w:cs="Times New Roman"/>
+                <w:rFonts w:ascii="Times New Roman" w:hAnsi="Times New Roman" w:cs="Times New Roman"/>
                 <w:sz w:val="20"/>
                 <w:szCs w:val="20"/>
               </w:rPr>
@@ -12451,7 +13889,7 @@
             </w:r>
             <w:r>
               <w:rPr>
-                <w:rFonts w:ascii="Times New Roman" w:hAnsi="Times New Roman" w:eastAsia="Times New Roman" w:cs="Times New Roman"/>
+                <w:rFonts w:ascii="Times New Roman" w:hAnsi="Times New Roman" w:cs="Times New Roman"/>
                 <w:sz w:val="20"/>
                 <w:szCs w:val="20"/>
               </w:rPr>
@@ -12496,7 +13934,6 @@
               </w:rPr>
               <w:t xml:space="preserve">Identificador </w:t>
             </w:r>
-            <w:r/>
             <w:r>
               <w:rPr>
                 <w:rFonts w:ascii="Times New Roman" w:hAnsi="Times New Roman" w:eastAsia="Times New Roman" w:cs="Times New Roman"/>
@@ -12515,7 +13952,7 @@
             </w:r>
             <w:r>
               <w:rPr>
-                <w:rFonts w:ascii="Times New Roman" w:hAnsi="Times New Roman" w:eastAsia="Times New Roman" w:cs="Times New Roman"/>
+                <w:rFonts w:ascii="Times New Roman" w:hAnsi="Times New Roman" w:cs="Times New Roman"/>
                 <w:sz w:val="20"/>
                 <w:szCs w:val="20"/>
               </w:rPr>
@@ -12558,7 +13995,7 @@
             </w:r>
             <w:r>
               <w:rPr>
-                <w:rFonts w:ascii="Times New Roman" w:hAnsi="Times New Roman" w:eastAsia="Times New Roman" w:cs="Times New Roman"/>
+                <w:rFonts w:ascii="Times New Roman" w:hAnsi="Times New Roman" w:cs="Times New Roman"/>
                 <w:sz w:val="20"/>
                 <w:szCs w:val="20"/>
               </w:rPr>
@@ -12601,7 +14038,7 @@
             </w:r>
             <w:r>
               <w:rPr>
-                <w:rFonts w:ascii="Times New Roman" w:hAnsi="Times New Roman" w:eastAsia="Times New Roman" w:cs="Times New Roman"/>
+                <w:rFonts w:ascii="Times New Roman" w:hAnsi="Times New Roman" w:cs="Times New Roman"/>
                 <w:sz w:val="20"/>
                 <w:szCs w:val="20"/>
               </w:rPr>
@@ -12644,7 +14081,7 @@
             </w:r>
             <w:r>
               <w:rPr>
-                <w:rFonts w:ascii="Times New Roman" w:hAnsi="Times New Roman" w:eastAsia="Times New Roman" w:cs="Times New Roman"/>
+                <w:rFonts w:ascii="Times New Roman" w:hAnsi="Times New Roman" w:cs="Times New Roman"/>
                 <w:sz w:val="20"/>
                 <w:szCs w:val="20"/>
               </w:rPr>
@@ -12687,7 +14124,7 @@
             </w:r>
             <w:r>
               <w:rPr>
-                <w:rFonts w:ascii="Times New Roman" w:hAnsi="Times New Roman" w:eastAsia="Times New Roman" w:cs="Times New Roman"/>
+                <w:rFonts w:ascii="Times New Roman" w:hAnsi="Times New Roman" w:cs="Times New Roman"/>
                 <w:sz w:val="20"/>
                 <w:szCs w:val="20"/>
               </w:rPr>
@@ -12730,7 +14167,7 @@
             </w:r>
             <w:r>
               <w:rPr>
-                <w:rFonts w:ascii="Times New Roman" w:hAnsi="Times New Roman" w:eastAsia="Times New Roman" w:cs="Times New Roman"/>
+                <w:rFonts w:ascii="Times New Roman" w:hAnsi="Times New Roman" w:cs="Times New Roman"/>
                 <w:sz w:val="20"/>
                 <w:szCs w:val="20"/>
               </w:rPr>
@@ -12787,7 +14224,7 @@
             </w:r>
             <w:r>
               <w:rPr>
-                <w:rFonts w:ascii="Times New Roman" w:hAnsi="Times New Roman" w:eastAsia="Times New Roman" w:cs="Times New Roman"/>
+                <w:rFonts w:ascii="Times New Roman" w:hAnsi="Times New Roman" w:cs="Times New Roman"/>
                 <w:sz w:val="20"/>
                 <w:szCs w:val="20"/>
               </w:rPr>
@@ -12830,7 +14267,7 @@
             </w:r>
             <w:r>
               <w:rPr>
-                <w:rFonts w:ascii="Times New Roman" w:hAnsi="Times New Roman" w:eastAsia="Times New Roman" w:cs="Times New Roman"/>
+                <w:rFonts w:ascii="Times New Roman" w:hAnsi="Times New Roman" w:cs="Times New Roman"/>
                 <w:sz w:val="20"/>
                 <w:szCs w:val="20"/>
               </w:rPr>
@@ -12873,7 +14310,7 @@
             </w:r>
             <w:r>
               <w:rPr>
-                <w:rFonts w:ascii="Times New Roman" w:hAnsi="Times New Roman" w:eastAsia="Times New Roman" w:cs="Times New Roman"/>
+                <w:rFonts w:ascii="Times New Roman" w:hAnsi="Times New Roman" w:cs="Times New Roman"/>
                 <w:sz w:val="20"/>
                 <w:szCs w:val="20"/>
               </w:rPr>
@@ -12916,7 +14353,7 @@
             </w:r>
             <w:r>
               <w:rPr>
-                <w:rFonts w:ascii="Times New Roman" w:hAnsi="Times New Roman" w:eastAsia="Times New Roman" w:cs="Times New Roman"/>
+                <w:rFonts w:ascii="Times New Roman" w:hAnsi="Times New Roman" w:cs="Times New Roman"/>
                 <w:sz w:val="20"/>
                 <w:szCs w:val="20"/>
               </w:rPr>
@@ -12959,7 +14396,7 @@
             </w:r>
             <w:r>
               <w:rPr>
-                <w:rFonts w:ascii="Times New Roman" w:hAnsi="Times New Roman" w:eastAsia="Times New Roman" w:cs="Times New Roman"/>
+                <w:rFonts w:ascii="Times New Roman" w:hAnsi="Times New Roman" w:cs="Times New Roman"/>
                 <w:sz w:val="20"/>
                 <w:szCs w:val="20"/>
               </w:rPr>
@@ -13002,7 +14439,7 @@
             </w:r>
             <w:r>
               <w:rPr>
-                <w:rFonts w:ascii="Times New Roman" w:hAnsi="Times New Roman" w:eastAsia="Times New Roman" w:cs="Times New Roman"/>
+                <w:rFonts w:ascii="Times New Roman" w:hAnsi="Times New Roman" w:cs="Times New Roman"/>
                 <w:sz w:val="20"/>
                 <w:szCs w:val="20"/>
               </w:rPr>
@@ -13018,7 +14455,6 @@
         <w:ind/>
         <w:rPr/>
       </w:pPr>
-      <w:r/>
       <w:r/>
       <w:r/>
     </w:p>
@@ -13457,7 +14893,7 @@
             </w:r>
             <w:r>
               <w:rPr>
-                <w:rFonts w:ascii="Times New Roman" w:hAnsi="Times New Roman" w:eastAsia="Times New Roman" w:cs="Times New Roman"/>
+                <w:rFonts w:ascii="Times New Roman" w:hAnsi="Times New Roman" w:cs="Times New Roman"/>
                 <w:sz w:val="20"/>
                 <w:szCs w:val="20"/>
               </w:rPr>
@@ -13500,7 +14936,7 @@
             </w:r>
             <w:r>
               <w:rPr>
-                <w:rFonts w:ascii="Times New Roman" w:hAnsi="Times New Roman" w:eastAsia="Times New Roman" w:cs="Times New Roman"/>
+                <w:rFonts w:ascii="Times New Roman" w:hAnsi="Times New Roman" w:cs="Times New Roman"/>
                 <w:sz w:val="20"/>
                 <w:szCs w:val="20"/>
               </w:rPr>
@@ -13543,7 +14979,7 @@
             </w:r>
             <w:r>
               <w:rPr>
-                <w:rFonts w:ascii="Times New Roman" w:hAnsi="Times New Roman" w:eastAsia="Times New Roman" w:cs="Times New Roman"/>
+                <w:rFonts w:ascii="Times New Roman" w:hAnsi="Times New Roman" w:cs="Times New Roman"/>
                 <w:sz w:val="20"/>
                 <w:szCs w:val="20"/>
               </w:rPr>
@@ -13586,7 +15022,7 @@
             </w:r>
             <w:r>
               <w:rPr>
-                <w:rFonts w:ascii="Times New Roman" w:hAnsi="Times New Roman" w:eastAsia="Times New Roman" w:cs="Times New Roman"/>
+                <w:rFonts w:ascii="Times New Roman" w:hAnsi="Times New Roman" w:cs="Times New Roman"/>
                 <w:sz w:val="20"/>
                 <w:szCs w:val="20"/>
               </w:rPr>
@@ -13629,7 +15065,7 @@
             </w:r>
             <w:r>
               <w:rPr>
-                <w:rFonts w:ascii="Times New Roman" w:hAnsi="Times New Roman" w:eastAsia="Times New Roman" w:cs="Times New Roman"/>
+                <w:rFonts w:ascii="Times New Roman" w:hAnsi="Times New Roman" w:cs="Times New Roman"/>
                 <w:sz w:val="20"/>
                 <w:szCs w:val="20"/>
               </w:rPr>
@@ -13672,7 +15108,7 @@
             </w:r>
             <w:r>
               <w:rPr>
-                <w:rFonts w:ascii="Times New Roman" w:hAnsi="Times New Roman" w:eastAsia="Times New Roman" w:cs="Times New Roman"/>
+                <w:rFonts w:ascii="Times New Roman" w:hAnsi="Times New Roman" w:cs="Times New Roman"/>
                 <w:sz w:val="20"/>
                 <w:szCs w:val="20"/>
               </w:rPr>
@@ -13718,7 +15154,7 @@
             </w:r>
             <w:r>
               <w:rPr>
-                <w:rFonts w:ascii="Times New Roman" w:hAnsi="Times New Roman" w:eastAsia="Times New Roman" w:cs="Times New Roman"/>
+                <w:rFonts w:ascii="Times New Roman" w:hAnsi="Times New Roman" w:cs="Times New Roman"/>
                 <w:sz w:val="20"/>
                 <w:szCs w:val="20"/>
               </w:rPr>
@@ -13761,7 +15197,7 @@
             </w:r>
             <w:r>
               <w:rPr>
-                <w:rFonts w:ascii="Times New Roman" w:hAnsi="Times New Roman" w:eastAsia="Times New Roman" w:cs="Times New Roman"/>
+                <w:rFonts w:ascii="Times New Roman" w:hAnsi="Times New Roman" w:cs="Times New Roman"/>
                 <w:sz w:val="20"/>
                 <w:szCs w:val="20"/>
               </w:rPr>
@@ -13804,7 +15240,7 @@
             </w:r>
             <w:r>
               <w:rPr>
-                <w:rFonts w:ascii="Times New Roman" w:hAnsi="Times New Roman" w:eastAsia="Times New Roman" w:cs="Times New Roman"/>
+                <w:rFonts w:ascii="Times New Roman" w:hAnsi="Times New Roman" w:cs="Times New Roman"/>
                 <w:sz w:val="20"/>
                 <w:szCs w:val="20"/>
               </w:rPr>
@@ -13847,7 +15283,7 @@
             </w:r>
             <w:r>
               <w:rPr>
-                <w:rFonts w:ascii="Times New Roman" w:hAnsi="Times New Roman" w:eastAsia="Times New Roman" w:cs="Times New Roman"/>
+                <w:rFonts w:ascii="Times New Roman" w:hAnsi="Times New Roman" w:cs="Times New Roman"/>
                 <w:sz w:val="20"/>
                 <w:szCs w:val="20"/>
               </w:rPr>
@@ -13890,7 +15326,7 @@
             </w:r>
             <w:r>
               <w:rPr>
-                <w:rFonts w:ascii="Times New Roman" w:hAnsi="Times New Roman" w:eastAsia="Times New Roman" w:cs="Times New Roman"/>
+                <w:rFonts w:ascii="Times New Roman" w:hAnsi="Times New Roman" w:cs="Times New Roman"/>
                 <w:sz w:val="20"/>
                 <w:szCs w:val="20"/>
               </w:rPr>
@@ -13933,7 +15369,7 @@
             </w:r>
             <w:r>
               <w:rPr>
-                <w:rFonts w:ascii="Times New Roman" w:hAnsi="Times New Roman" w:eastAsia="Times New Roman" w:cs="Times New Roman"/>
+                <w:rFonts w:ascii="Times New Roman" w:hAnsi="Times New Roman" w:cs="Times New Roman"/>
                 <w:sz w:val="20"/>
                 <w:szCs w:val="20"/>
               </w:rPr>
@@ -13949,7 +15385,6 @@
         <w:ind/>
         <w:rPr/>
       </w:pPr>
-      <w:r/>
       <w:r/>
       <w:r/>
     </w:p>
@@ -14388,7 +15823,7 @@
             </w:r>
             <w:r>
               <w:rPr>
-                <w:rFonts w:ascii="Times New Roman" w:hAnsi="Times New Roman" w:eastAsia="Times New Roman" w:cs="Times New Roman"/>
+                <w:rFonts w:ascii="Times New Roman" w:hAnsi="Times New Roman" w:cs="Times New Roman"/>
                 <w:sz w:val="20"/>
                 <w:szCs w:val="20"/>
               </w:rPr>
@@ -14431,7 +15866,7 @@
             </w:r>
             <w:r>
               <w:rPr>
-                <w:rFonts w:ascii="Times New Roman" w:hAnsi="Times New Roman" w:eastAsia="Times New Roman" w:cs="Times New Roman"/>
+                <w:rFonts w:ascii="Times New Roman" w:hAnsi="Times New Roman" w:cs="Times New Roman"/>
                 <w:sz w:val="20"/>
                 <w:szCs w:val="20"/>
               </w:rPr>
@@ -14474,7 +15909,7 @@
             </w:r>
             <w:r>
               <w:rPr>
-                <w:rFonts w:ascii="Times New Roman" w:hAnsi="Times New Roman" w:eastAsia="Times New Roman" w:cs="Times New Roman"/>
+                <w:rFonts w:ascii="Times New Roman" w:hAnsi="Times New Roman" w:cs="Times New Roman"/>
                 <w:sz w:val="20"/>
                 <w:szCs w:val="20"/>
               </w:rPr>
@@ -14517,7 +15952,7 @@
             </w:r>
             <w:r>
               <w:rPr>
-                <w:rFonts w:ascii="Times New Roman" w:hAnsi="Times New Roman" w:eastAsia="Times New Roman" w:cs="Times New Roman"/>
+                <w:rFonts w:ascii="Times New Roman" w:hAnsi="Times New Roman" w:cs="Times New Roman"/>
                 <w:sz w:val="20"/>
                 <w:szCs w:val="20"/>
               </w:rPr>
@@ -14560,7 +15995,7 @@
             </w:r>
             <w:r>
               <w:rPr>
-                <w:rFonts w:ascii="Times New Roman" w:hAnsi="Times New Roman" w:eastAsia="Times New Roman" w:cs="Times New Roman"/>
+                <w:rFonts w:ascii="Times New Roman" w:hAnsi="Times New Roman" w:cs="Times New Roman"/>
                 <w:sz w:val="20"/>
                 <w:szCs w:val="20"/>
               </w:rPr>
@@ -14603,7 +16038,7 @@
             </w:r>
             <w:r>
               <w:rPr>
-                <w:rFonts w:ascii="Times New Roman" w:hAnsi="Times New Roman" w:eastAsia="Times New Roman" w:cs="Times New Roman"/>
+                <w:rFonts w:ascii="Times New Roman" w:hAnsi="Times New Roman" w:cs="Times New Roman"/>
                 <w:sz w:val="20"/>
                 <w:szCs w:val="20"/>
               </w:rPr>
@@ -14649,7 +16084,7 @@
             </w:r>
             <w:r>
               <w:rPr>
-                <w:rFonts w:ascii="Times New Roman" w:hAnsi="Times New Roman" w:eastAsia="Times New Roman" w:cs="Times New Roman"/>
+                <w:rFonts w:ascii="Times New Roman" w:hAnsi="Times New Roman" w:cs="Times New Roman"/>
                 <w:sz w:val="20"/>
                 <w:szCs w:val="20"/>
               </w:rPr>
@@ -14692,7 +16127,7 @@
             </w:r>
             <w:r>
               <w:rPr>
-                <w:rFonts w:ascii="Times New Roman" w:hAnsi="Times New Roman" w:eastAsia="Times New Roman" w:cs="Times New Roman"/>
+                <w:rFonts w:ascii="Times New Roman" w:hAnsi="Times New Roman" w:cs="Times New Roman"/>
                 <w:sz w:val="20"/>
                 <w:szCs w:val="20"/>
               </w:rPr>
@@ -14735,7 +16170,7 @@
             </w:r>
             <w:r>
               <w:rPr>
-                <w:rFonts w:ascii="Times New Roman" w:hAnsi="Times New Roman" w:eastAsia="Times New Roman" w:cs="Times New Roman"/>
+                <w:rFonts w:ascii="Times New Roman" w:hAnsi="Times New Roman" w:cs="Times New Roman"/>
                 <w:sz w:val="20"/>
                 <w:szCs w:val="20"/>
               </w:rPr>
@@ -14778,7 +16213,7 @@
             </w:r>
             <w:r>
               <w:rPr>
-                <w:rFonts w:ascii="Times New Roman" w:hAnsi="Times New Roman" w:eastAsia="Times New Roman" w:cs="Times New Roman"/>
+                <w:rFonts w:ascii="Times New Roman" w:hAnsi="Times New Roman" w:cs="Times New Roman"/>
                 <w:sz w:val="20"/>
                 <w:szCs w:val="20"/>
               </w:rPr>
@@ -14821,7 +16256,7 @@
             </w:r>
             <w:r>
               <w:rPr>
-                <w:rFonts w:ascii="Times New Roman" w:hAnsi="Times New Roman" w:eastAsia="Times New Roman" w:cs="Times New Roman"/>
+                <w:rFonts w:ascii="Times New Roman" w:hAnsi="Times New Roman" w:cs="Times New Roman"/>
                 <w:sz w:val="20"/>
                 <w:szCs w:val="20"/>
               </w:rPr>
@@ -14864,7 +16299,7 @@
             </w:r>
             <w:r>
               <w:rPr>
-                <w:rFonts w:ascii="Times New Roman" w:hAnsi="Times New Roman" w:eastAsia="Times New Roman" w:cs="Times New Roman"/>
+                <w:rFonts w:ascii="Times New Roman" w:hAnsi="Times New Roman" w:cs="Times New Roman"/>
                 <w:sz w:val="20"/>
                 <w:szCs w:val="20"/>
               </w:rPr>

</xml_diff>